<commit_message>
courseware: v21 deck — Activity 1 setup & GitHub screenshots; LG v1.9, LP v2.0
Turn the Claude Desktop, VS Code and GitHub screenshots into seven
explained, annotated slides inside Topic 1 / Activity 1:
- 22 Claude Code in the Desktop App (Code tab, project folder, mode/model)
- 24 Install the Claude Code Extension (verified Anthropic publisher)
- 25 Move Claude Code to the Secondary Side Bar (+ New session)
- 36 Allow Bypass Permissions — VS Code & Desktop settings
- 47-49 Step 5: create, configure and push to a GitHub repository

Renumber footers (77 slides), add missing page numbers, and set the
cover to Version 21.0 · 29 Oct 2026. Learner Guide v1.9 adds the same
annotated figures (sections 1.4, 1.9 and Activity 1 Step 5) plus a
page footer; Lesson Plan v2.0 recomputes every slide reference for v21,
populates its table of contents and replaces the retired Mini Capstone
with Activities 6-7. README points at the v21 package.

Co-Authored-By: Claude Opus 5.5 <noreply@anthropic.com>
</commit_message>
<xml_diff>
--- a/courseware/LG-Agentic AI Applications with Claude Code.docx
+++ b/courseware/LG-Agentic AI Applications with Claude Code.docx
@@ -169,7 +169,7 @@
           <w:b/>
           <w:sz w:val="24"/>
         </w:rPr>
-        <w:t>Version 1.8</w:t>
+        <w:t>Version 1.9</w:t>
       </w:r>
     </w:p>
     <w:p>
@@ -790,6 +790,60 @@
           </w:p>
         </w:tc>
       </w:tr>
+      <w:tr>
+        <w:tc>
+          <w:tcPr>
+            <w:tcW w:type="dxa" w:w="2340"/>
+          </w:tcPr>
+          <w:p>
+            <w:pPr/>
+            <w:r>
+              <w:rPr>
+                <w:rPr/>
+              </w:rPr>
+              <w:t>1.9</w:t>
+            </w:r>
+          </w:p>
+        </w:tc>
+        <w:tc>
+          <w:tcPr>
+            <w:tcW w:type="dxa" w:w="2340"/>
+          </w:tcPr>
+          <w:p>
+            <w:pPr/>
+            <w:r>
+              <w:rPr>
+                <w:rPr/>
+              </w:rPr>
+              <w:t>29 Oct 2026</w:t>
+            </w:r>
+          </w:p>
+        </w:tc>
+        <w:tc>
+          <w:tcPr>
+            <w:tcW w:type="dxa" w:w="2340"/>
+          </w:tcPr>
+          <w:p>
+            <w:r>
+              <w:t>Aligned with slide deck v21: added annotated screenshots with step-by-step explanations for the Claude Desktop Code tab, installing the VS Code extension and docking it in the secondary side bar (1.4), allowing bypass mode in VS Code and Desktop (1.9), and creating a GitHub repository and pushing with Claude in Activity 1, Step 5.</w:t>
+            </w:r>
+          </w:p>
+        </w:tc>
+        <w:tc>
+          <w:tcPr>
+            <w:tcW w:type="dxa" w:w="2340"/>
+          </w:tcPr>
+          <w:p>
+            <w:pPr/>
+            <w:r>
+              <w:rPr>
+                <w:rPr/>
+              </w:rPr>
+              <w:t>Tertiary Infotech Academy Pte Ltd</w:t>
+            </w:r>
+          </w:p>
+        </w:tc>
+      </w:tr>
     </w:tbl>
     <w:p>
       <w:r>
@@ -824,7 +878,7 @@
         </w:rPr>
         <w:t>Topic 1 — Claude Code Fundamentals</w:t>
         <w:tab/>
-        <w:t>5</w:t>
+        <w:t>6</w:t>
       </w:r>
     </w:p>
     <w:p>
@@ -843,7 +897,7 @@
         </w:rPr>
         <w:t>Topic 2 — Tools and Commands</w:t>
         <w:tab/>
-        <w:t>12</w:t>
+        <w:t>19</w:t>
       </w:r>
     </w:p>
     <w:p>
@@ -862,7 +916,7 @@
         </w:rPr>
         <w:t>Topic 3 — Skills, Agents &amp; Hooks</w:t>
         <w:tab/>
-        <w:t>15</w:t>
+        <w:t>23</w:t>
       </w:r>
     </w:p>
     <w:p>
@@ -2468,6 +2522,597 @@
       </w:r>
       <w:r>
         <w:t xml:space="preserve">a full GUI for parallel sessions, scheduled tasks (Routines), and connectors.</w:t>
+      </w:r>
+    </w:p>
+    <w:p>
+      <w:pPr>
+        <w:pStyle w:val="BodyText"/>
+      </w:pPr>
+      <w:r>
+        <w:rPr>
+          <w:b/>
+        </w:rPr>
+        <w:t xml:space="preserve">Claude Code in the Desktop app. </w:t>
+      </w:r>
+      <w:r>
+        <w:rPr/>
+        <w:t>Prefer a GUI? Open the Claude Desktop app, switch to the Code tab and point it at a project folder — it runs the same agentic loop as the CLI.</w:t>
+      </w:r>
+    </w:p>
+    <w:p>
+      <w:pPr>
+        <w:pStyle w:val="BodyText"/>
+        <w:keepNext/>
+        <w:spacing w:before="120"/>
+        <w:jc w:val="center"/>
+      </w:pPr>
+      <w:r>
+        <w:drawing>
+          <wp:inline xmlns:a="http://schemas.openxmlformats.org/drawingml/2006/main" xmlns:pic="http://schemas.openxmlformats.org/drawingml/2006/picture">
+            <wp:extent cx="5486400" cy="3741023"/>
+            <wp:docPr id="2" name="Picture 2"/>
+            <wp:cNvGraphicFramePr>
+              <a:graphicFrameLocks noChangeAspect="1"/>
+            </wp:cNvGraphicFramePr>
+            <a:graphic>
+              <a:graphicData uri="http://schemas.openxmlformats.org/drawingml/2006/picture">
+                <pic:pic>
+                  <pic:nvPicPr>
+                    <pic:cNvPr id="0" name="s02_annotated.png"/>
+                    <pic:cNvPicPr/>
+                  </pic:nvPicPr>
+                  <pic:blipFill>
+                    <a:blip r:embed="rId10"/>
+                    <a:stretch>
+                      <a:fillRect/>
+                    </a:stretch>
+                  </pic:blipFill>
+                  <pic:spPr>
+                    <a:xfrm>
+                      <a:off x="0" y="0"/>
+                      <a:ext cx="5486400" cy="3741023"/>
+                    </a:xfrm>
+                    <a:prstGeom prst="rect"/>
+                  </pic:spPr>
+                </pic:pic>
+              </a:graphicData>
+            </a:graphic>
+          </wp:inline>
+        </w:drawing>
+      </w:r>
+    </w:p>
+    <w:p>
+      <w:pPr>
+        <w:pStyle w:val="Caption"/>
+        <w:jc w:val="center"/>
+      </w:pPr>
+      <w:r>
+        <w:rPr>
+          <w:i/>
+          <w:color w:val="6B6862"/>
+          <w:sz w:val="19"/>
+        </w:rPr>
+        <w:t>Figure 1 — Claude Code in the Claude Desktop app (Code tab)</w:t>
+      </w:r>
+    </w:p>
+    <w:p>
+      <w:pPr>
+        <w:numPr>
+          <w:ilvl w:val="0"/>
+          <w:numId w:val="18"/>
+        </w:numPr>
+        <w:pStyle w:val="Compact"/>
+      </w:pPr>
+      <w:r>
+        <w:rPr>
+          <w:b/>
+        </w:rPr>
+        <w:t>1 Open the Code tab —</w:t>
+      </w:r>
+      <w:r>
+        <w:rPr/>
+        <w:t xml:space="preserve"> click the &lt;/&gt; icon at the top-left to switch from Chat to Claude Code.</w:t>
+      </w:r>
+    </w:p>
+    <w:p>
+      <w:pPr>
+        <w:numPr>
+          <w:ilvl w:val="0"/>
+          <w:numId w:val="18"/>
+        </w:numPr>
+        <w:pStyle w:val="Compact"/>
+      </w:pPr>
+      <w:r>
+        <w:rPr>
+          <w:b/>
+        </w:rPr>
+        <w:t>2 Choose your project folder —</w:t>
+      </w:r>
+      <w:r>
+        <w:rPr/>
+        <w:t xml:space="preserve"> pick a folder (here kanban8); Claude reads and edits files only inside it.</w:t>
+      </w:r>
+    </w:p>
+    <w:p>
+      <w:pPr>
+        <w:numPr>
+          <w:ilvl w:val="0"/>
+          <w:numId w:val="18"/>
+        </w:numPr>
+        <w:pStyle w:val="Compact"/>
+      </w:pPr>
+      <w:r>
+        <w:rPr>
+          <w:b/>
+        </w:rPr>
+        <w:t>3 Describe the task —</w:t>
+      </w:r>
+      <w:r>
+        <w:rPr/>
+        <w:t xml:space="preserve"> type your goal in plain English and press Enter.</w:t>
+      </w:r>
+    </w:p>
+    <w:p>
+      <w:pPr>
+        <w:numPr>
+          <w:ilvl w:val="0"/>
+          <w:numId w:val="18"/>
+        </w:numPr>
+        <w:pStyle w:val="Compact"/>
+      </w:pPr>
+      <w:r>
+        <w:rPr>
+          <w:b/>
+        </w:rPr>
+        <w:t>4 Check folder, mode &amp; model —</w:t>
+      </w:r>
+      <w:r>
+        <w:rPr/>
+        <w:t xml:space="preserve"> the status bar shows the folder, permission mode (Plan) and model (Sonnet 5.5 · Medium).</w:t>
+      </w:r>
+    </w:p>
+    <w:p>
+      <w:pPr>
+        <w:numPr>
+          <w:ilvl w:val="0"/>
+          <w:numId w:val="18"/>
+        </w:numPr>
+        <w:pStyle w:val="Compact"/>
+      </w:pPr>
+      <w:r>
+        <w:rPr>
+          <w:b/>
+        </w:rPr>
+        <w:t>5 Sessions grouped by project —</w:t>
+      </w:r>
+      <w:r>
+        <w:rPr/>
+        <w:t xml:space="preserve"> the sidebar lists past sessions under each project; click one to resume. “Import Claude Code CLI sessions” brings your terminal history in.</w:t>
+      </w:r>
+    </w:p>
+    <w:p>
+      <w:pPr>
+        <w:pStyle w:val="BodyText"/>
+      </w:pPr>
+      <w:r>
+        <w:rPr>
+          <w:b/>
+        </w:rPr>
+        <w:t xml:space="preserve">Install the Claude Code extension in VS Code. </w:t>
+      </w:r>
+      <w:r>
+        <w:rPr/>
+        <w:t>Install only the official extension published by Anthropic — an extension can read your whole codebase.</w:t>
+      </w:r>
+    </w:p>
+    <w:p>
+      <w:pPr>
+        <w:pStyle w:val="BodyText"/>
+        <w:keepNext/>
+        <w:spacing w:before="120"/>
+        <w:jc w:val="center"/>
+      </w:pPr>
+      <w:r>
+        <w:drawing>
+          <wp:inline xmlns:a="http://schemas.openxmlformats.org/drawingml/2006/main" xmlns:pic="http://schemas.openxmlformats.org/drawingml/2006/picture">
+            <wp:extent cx="5486400" cy="3939287"/>
+            <wp:docPr id="3" name="Picture 3"/>
+            <wp:cNvGraphicFramePr>
+              <a:graphicFrameLocks noChangeAspect="1"/>
+            </wp:cNvGraphicFramePr>
+            <a:graphic>
+              <a:graphicData uri="http://schemas.openxmlformats.org/drawingml/2006/picture">
+                <pic:pic>
+                  <pic:nvPicPr>
+                    <pic:cNvPr id="0" name="s04_annotated.png"/>
+                    <pic:cNvPicPr/>
+                  </pic:nvPicPr>
+                  <pic:blipFill>
+                    <a:blip r:embed="rId11"/>
+                    <a:stretch>
+                      <a:fillRect/>
+                    </a:stretch>
+                  </pic:blipFill>
+                  <pic:spPr>
+                    <a:xfrm>
+                      <a:off x="0" y="0"/>
+                      <a:ext cx="5486400" cy="3939287"/>
+                    </a:xfrm>
+                    <a:prstGeom prst="rect"/>
+                  </pic:spPr>
+                </pic:pic>
+              </a:graphicData>
+            </a:graphic>
+          </wp:inline>
+        </w:drawing>
+      </w:r>
+    </w:p>
+    <w:p>
+      <w:pPr>
+        <w:pStyle w:val="Caption"/>
+        <w:jc w:val="center"/>
+      </w:pPr>
+      <w:r>
+        <w:rPr>
+          <w:i/>
+          <w:color w:val="6B6862"/>
+          <w:sz w:val="19"/>
+        </w:rPr>
+        <w:t>Figure 2 — Installing “Claude Code for VS Code” from the Marketplace</w:t>
+      </w:r>
+    </w:p>
+    <w:p>
+      <w:pPr>
+        <w:numPr>
+          <w:ilvl w:val="0"/>
+          <w:numId w:val="18"/>
+        </w:numPr>
+        <w:pStyle w:val="Compact"/>
+      </w:pPr>
+      <w:r>
+        <w:rPr>
+          <w:b/>
+        </w:rPr>
+        <w:t>1 Open Extensions —</w:t>
+      </w:r>
+      <w:r>
+        <w:rPr/>
+        <w:t xml:space="preserve"> click the Extensions icon or press Ctrl+Shift+X (Cmd+Shift+X on Mac).</w:t>
+      </w:r>
+    </w:p>
+    <w:p>
+      <w:pPr>
+        <w:numPr>
+          <w:ilvl w:val="0"/>
+          <w:numId w:val="18"/>
+        </w:numPr>
+        <w:pStyle w:val="Compact"/>
+      </w:pPr>
+      <w:r>
+        <w:rPr>
+          <w:b/>
+        </w:rPr>
+        <w:t>2 Search “claude” —</w:t>
+      </w:r>
+      <w:r>
+        <w:rPr/>
+        <w:t xml:space="preserve"> type claude in the Marketplace search box.</w:t>
+      </w:r>
+    </w:p>
+    <w:p>
+      <w:pPr>
+        <w:numPr>
+          <w:ilvl w:val="0"/>
+          <w:numId w:val="18"/>
+        </w:numPr>
+        <w:pStyle w:val="Compact"/>
+      </w:pPr>
+      <w:r>
+        <w:rPr>
+          <w:b/>
+        </w:rPr>
+        <w:t>3 Pick “Claude Code for VS Code” —</w:t>
+      </w:r>
+      <w:r>
+        <w:rPr/>
+        <w:t xml:space="preserve"> select the result published by Anthropic.</w:t>
+      </w:r>
+    </w:p>
+    <w:p>
+      <w:pPr>
+        <w:numPr>
+          <w:ilvl w:val="0"/>
+          <w:numId w:val="18"/>
+        </w:numPr>
+        <w:pStyle w:val="Compact"/>
+      </w:pPr>
+      <w:r>
+        <w:rPr>
+          <w:b/>
+        </w:rPr>
+        <w:t>4 Check the publisher —</w:t>
+      </w:r>
+      <w:r>
+        <w:rPr/>
+        <w:t xml:space="preserve"> look for the blue verified tick and anthropic.com; skip look-alike extensions.</w:t>
+      </w:r>
+    </w:p>
+    <w:p>
+      <w:pPr>
+        <w:numPr>
+          <w:ilvl w:val="0"/>
+          <w:numId w:val="18"/>
+        </w:numPr>
+        <w:pStyle w:val="Compact"/>
+      </w:pPr>
+      <w:r>
+        <w:rPr>
+          <w:b/>
+        </w:rPr>
+        <w:t>5 Install &amp; keep it updated —</w:t>
+      </w:r>
+      <w:r>
+        <w:rPr/>
+        <w:t xml:space="preserve"> click Install and leave Auto Update ticked.</w:t>
+      </w:r>
+    </w:p>
+    <w:p>
+      <w:pPr>
+        <w:pStyle w:val="BodyText"/>
+      </w:pPr>
+      <w:r>
+        <w:rPr>
+          <w:b/>
+        </w:rPr>
+        <w:t xml:space="preserve">Move Claude Code to the secondary side bar. </w:t>
+      </w:r>
+      <w:r>
+        <w:rPr/>
+        <w:t>Right-click the Claude icon → Move To → Secondary Side Bar. Your files stay on the left, the editor in the middle and Claude Code on the right.</w:t>
+      </w:r>
+    </w:p>
+    <w:p>
+      <w:pPr>
+        <w:pStyle w:val="BodyText"/>
+        <w:keepNext/>
+        <w:spacing w:before="120"/>
+        <w:jc w:val="center"/>
+      </w:pPr>
+      <w:r>
+        <w:drawing>
+          <wp:inline xmlns:a="http://schemas.openxmlformats.org/drawingml/2006/main" xmlns:pic="http://schemas.openxmlformats.org/drawingml/2006/picture">
+            <wp:extent cx="3840480" cy="453600"/>
+            <wp:docPr id="4" name="Picture 4"/>
+            <wp:cNvGraphicFramePr>
+              <a:graphicFrameLocks noChangeAspect="1"/>
+            </wp:cNvGraphicFramePr>
+            <a:graphic>
+              <a:graphicData uri="http://schemas.openxmlformats.org/drawingml/2006/picture">
+                <pic:pic>
+                  <pic:nvPicPr>
+                    <pic:cNvPr id="0" name="s05_annotated.png"/>
+                    <pic:cNvPicPr/>
+                  </pic:nvPicPr>
+                  <pic:blipFill>
+                    <a:blip r:embed="rId12"/>
+                    <a:stretch>
+                      <a:fillRect/>
+                    </a:stretch>
+                  </pic:blipFill>
+                  <pic:spPr>
+                    <a:xfrm>
+                      <a:off x="0" y="0"/>
+                      <a:ext cx="3840480" cy="453600"/>
+                    </a:xfrm>
+                    <a:prstGeom prst="rect"/>
+                  </pic:spPr>
+                </pic:pic>
+              </a:graphicData>
+            </a:graphic>
+          </wp:inline>
+        </w:drawing>
+      </w:r>
+    </w:p>
+    <w:p>
+      <w:pPr>
+        <w:pStyle w:val="Caption"/>
+        <w:jc w:val="center"/>
+      </w:pPr>
+      <w:r>
+        <w:rPr>
+          <w:i/>
+          <w:color w:val="6B6862"/>
+          <w:sz w:val="19"/>
+        </w:rPr>
+        <w:t>Figure 3 — Right-click the Claude icon → Move To → Secondary Side Bar</w:t>
+      </w:r>
+    </w:p>
+    <w:p>
+      <w:pPr>
+        <w:pStyle w:val="BodyText"/>
+        <w:keepNext/>
+        <w:spacing w:before="120"/>
+        <w:jc w:val="center"/>
+      </w:pPr>
+      <w:r>
+        <w:drawing>
+          <wp:inline xmlns:a="http://schemas.openxmlformats.org/drawingml/2006/main" xmlns:pic="http://schemas.openxmlformats.org/drawingml/2006/picture">
+            <wp:extent cx="5486400" cy="3337993"/>
+            <wp:docPr id="5" name="Picture 5"/>
+            <wp:cNvGraphicFramePr>
+              <a:graphicFrameLocks noChangeAspect="1"/>
+            </wp:cNvGraphicFramePr>
+            <a:graphic>
+              <a:graphicData uri="http://schemas.openxmlformats.org/drawingml/2006/picture">
+                <pic:pic>
+                  <pic:nvPicPr>
+                    <pic:cNvPr id="0" name="s06_annotated.png"/>
+                    <pic:cNvPicPr/>
+                  </pic:nvPicPr>
+                  <pic:blipFill>
+                    <a:blip r:embed="rId13"/>
+                    <a:stretch>
+                      <a:fillRect/>
+                    </a:stretch>
+                  </pic:blipFill>
+                  <pic:spPr>
+                    <a:xfrm>
+                      <a:off x="0" y="0"/>
+                      <a:ext cx="5486400" cy="3337993"/>
+                    </a:xfrm>
+                    <a:prstGeom prst="rect"/>
+                  </pic:spPr>
+                </pic:pic>
+              </a:graphicData>
+            </a:graphic>
+          </wp:inline>
+        </w:drawing>
+      </w:r>
+    </w:p>
+    <w:p>
+      <w:pPr>
+        <w:pStyle w:val="Caption"/>
+        <w:jc w:val="center"/>
+      </w:pPr>
+      <w:r>
+        <w:rPr>
+          <w:i/>
+          <w:color w:val="6B6862"/>
+          <w:sz w:val="19"/>
+        </w:rPr>
+        <w:t>Figure 4 — VS Code with Claude Code docked in the secondary side bar</w:t>
+      </w:r>
+    </w:p>
+    <w:p>
+      <w:pPr>
+        <w:numPr>
+          <w:ilvl w:val="0"/>
+          <w:numId w:val="18"/>
+        </w:numPr>
+        <w:pStyle w:val="Compact"/>
+      </w:pPr>
+      <w:r>
+        <w:rPr>
+          <w:b/>
+        </w:rPr>
+        <w:t>1 Files on the left —</w:t>
+      </w:r>
+      <w:r>
+        <w:rPr/>
+        <w:t xml:space="preserve"> the Explorer shows your project folder (kanban8).</w:t>
+      </w:r>
+    </w:p>
+    <w:p>
+      <w:pPr>
+        <w:numPr>
+          <w:ilvl w:val="0"/>
+          <w:numId w:val="18"/>
+        </w:numPr>
+        <w:pStyle w:val="Compact"/>
+      </w:pPr>
+      <w:r>
+        <w:rPr>
+          <w:b/>
+        </w:rPr>
+        <w:t>2 Claude Code on the right —</w:t>
+      </w:r>
+      <w:r>
+        <w:rPr/>
+        <w:t xml:space="preserve"> chat with Claude while you watch files change in the editor.</w:t>
+      </w:r>
+    </w:p>
+    <w:p>
+      <w:pPr>
+        <w:numPr>
+          <w:ilvl w:val="0"/>
+          <w:numId w:val="18"/>
+        </w:numPr>
+        <w:pStyle w:val="Compact"/>
+      </w:pPr>
+      <w:r>
+        <w:rPr>
+          <w:b/>
+        </w:rPr>
+        <w:t>3 New session &amp; history —</w:t>
+      </w:r>
+      <w:r>
+        <w:rPr/>
+        <w:t xml:space="preserve"> + starts a fresh session (Figure 5); the clock icon reopens past sessions.</w:t>
+      </w:r>
+    </w:p>
+    <w:p>
+      <w:pPr>
+        <w:numPr>
+          <w:ilvl w:val="0"/>
+          <w:numId w:val="18"/>
+        </w:numPr>
+        <w:pStyle w:val="Compact"/>
+      </w:pPr>
+      <w:r>
+        <w:rPr>
+          <w:b/>
+        </w:rPr>
+        <w:t>4 Prompt box —</w:t>
+      </w:r>
+      <w:r>
+        <w:rPr/>
+        <w:t xml:space="preserve"> Ctrl+Esc focuses Claude; / opens commands; choose Plan mode and the model here.</w:t>
+      </w:r>
+    </w:p>
+    <w:p>
+      <w:pPr>
+        <w:pStyle w:val="BodyText"/>
+        <w:keepNext/>
+        <w:spacing w:before="120"/>
+        <w:jc w:val="center"/>
+      </w:pPr>
+      <w:r>
+        <w:drawing>
+          <wp:inline xmlns:a="http://schemas.openxmlformats.org/drawingml/2006/main" xmlns:pic="http://schemas.openxmlformats.org/drawingml/2006/picture">
+            <wp:extent cx="1645920" cy="908733"/>
+            <wp:docPr id="6" name="Picture 6"/>
+            <wp:cNvGraphicFramePr>
+              <a:graphicFrameLocks noChangeAspect="1"/>
+            </wp:cNvGraphicFramePr>
+            <a:graphic>
+              <a:graphicData uri="http://schemas.openxmlformats.org/drawingml/2006/picture">
+                <pic:pic>
+                  <pic:nvPicPr>
+                    <pic:cNvPr id="0" name="s08_annotated.png"/>
+                    <pic:cNvPicPr/>
+                  </pic:nvPicPr>
+                  <pic:blipFill>
+                    <a:blip r:embed="rId14"/>
+                    <a:stretch>
+                      <a:fillRect/>
+                    </a:stretch>
+                  </pic:blipFill>
+                  <pic:spPr>
+                    <a:xfrm>
+                      <a:off x="0" y="0"/>
+                      <a:ext cx="1645920" cy="908733"/>
+                    </a:xfrm>
+                    <a:prstGeom prst="rect"/>
+                  </pic:spPr>
+                </pic:pic>
+              </a:graphicData>
+            </a:graphic>
+          </wp:inline>
+        </w:drawing>
+      </w:r>
+    </w:p>
+    <w:p>
+      <w:pPr>
+        <w:pStyle w:val="Caption"/>
+        <w:jc w:val="center"/>
+      </w:pPr>
+      <w:r>
+        <w:rPr>
+          <w:i/>
+          <w:color w:val="6B6862"/>
+          <w:sz w:val="19"/>
+        </w:rPr>
+        <w:t>Figure 5 — The New session button</w:t>
       </w:r>
     </w:p>
     <w:p>
@@ -3554,6 +4199,228 @@
           <w:rStyle w:val="NormalTok"/>
         </w:rPr>
         <w:t xml:space="preserve"> --permission-mode bypassPermissions   # or --dangerously-skip-permissions</w:t>
+      </w:r>
+    </w:p>
+    <w:p>
+      <w:pPr>
+        <w:pStyle w:val="BodyText"/>
+      </w:pPr>
+      <w:r>
+        <w:rPr>
+          <w:b/>
+        </w:rPr>
+        <w:t xml:space="preserve">Allow bypass mode in VS Code and Claude Desktop. </w:t>
+      </w:r>
+      <w:r>
+        <w:rPr/>
+        <w:t>Both apps hide the Bypass permissions mode until you allow it in Settings. Turn it on only for trusted, sandboxed projects.</w:t>
+      </w:r>
+    </w:p>
+    <w:p>
+      <w:pPr>
+        <w:pStyle w:val="BodyText"/>
+        <w:keepNext/>
+        <w:spacing w:before="120"/>
+        <w:jc w:val="center"/>
+      </w:pPr>
+      <w:r>
+        <w:drawing>
+          <wp:inline xmlns:a="http://schemas.openxmlformats.org/drawingml/2006/main" xmlns:pic="http://schemas.openxmlformats.org/drawingml/2006/picture">
+            <wp:extent cx="2926080" cy="3277712"/>
+            <wp:docPr id="7" name="Picture 7"/>
+            <wp:cNvGraphicFramePr>
+              <a:graphicFrameLocks noChangeAspect="1"/>
+            </wp:cNvGraphicFramePr>
+            <a:graphic>
+              <a:graphicData uri="http://schemas.openxmlformats.org/drawingml/2006/picture">
+                <pic:pic>
+                  <pic:nvPicPr>
+                    <pic:cNvPr id="0" name="s07_annotated.png"/>
+                    <pic:cNvPicPr/>
+                  </pic:nvPicPr>
+                  <pic:blipFill>
+                    <a:blip r:embed="rId15"/>
+                    <a:stretch>
+                      <a:fillRect/>
+                    </a:stretch>
+                  </pic:blipFill>
+                  <pic:spPr>
+                    <a:xfrm>
+                      <a:off x="0" y="0"/>
+                      <a:ext cx="2926080" cy="3277712"/>
+                    </a:xfrm>
+                    <a:prstGeom prst="rect"/>
+                  </pic:spPr>
+                </pic:pic>
+              </a:graphicData>
+            </a:graphic>
+          </wp:inline>
+        </w:drawing>
+      </w:r>
+    </w:p>
+    <w:p>
+      <w:pPr>
+        <w:pStyle w:val="Caption"/>
+        <w:jc w:val="center"/>
+      </w:pPr>
+      <w:r>
+        <w:rPr>
+          <w:i/>
+          <w:color w:val="6B6862"/>
+          <w:sz w:val="19"/>
+        </w:rPr>
+        <w:t>Figure 6 — VS Code: gear icon → Settings</w:t>
+      </w:r>
+    </w:p>
+    <w:p>
+      <w:pPr>
+        <w:numPr>
+          <w:ilvl w:val="0"/>
+          <w:numId w:val="18"/>
+        </w:numPr>
+        <w:pStyle w:val="Compact"/>
+      </w:pPr>
+      <w:r>
+        <w:rPr>
+          <w:b/>
+        </w:rPr>
+        <w:t>1 Gear icon —</w:t>
+      </w:r>
+      <w:r>
+        <w:rPr/>
+        <w:t xml:space="preserve"> bottom-left of VS Code.</w:t>
+      </w:r>
+    </w:p>
+    <w:p>
+      <w:pPr>
+        <w:numPr>
+          <w:ilvl w:val="0"/>
+          <w:numId w:val="18"/>
+        </w:numPr>
+        <w:pStyle w:val="Compact"/>
+      </w:pPr>
+      <w:r>
+        <w:rPr>
+          <w:b/>
+        </w:rPr>
+        <w:t>2 Settings —</w:t>
+      </w:r>
+      <w:r>
+        <w:rPr/>
+        <w:t xml:space="preserve"> or press Ctrl+, (Cmd+, on Mac); search “Claude Code” and tick “Allow dangerously skip permissions”, then pick Bypass permissions in the prompt-box mode menu.</w:t>
+      </w:r>
+    </w:p>
+    <w:p>
+      <w:pPr>
+        <w:pStyle w:val="BodyText"/>
+        <w:keepNext/>
+        <w:spacing w:before="120"/>
+        <w:jc w:val="center"/>
+      </w:pPr>
+      <w:r>
+        <w:drawing>
+          <wp:inline xmlns:a="http://schemas.openxmlformats.org/drawingml/2006/main" xmlns:pic="http://schemas.openxmlformats.org/drawingml/2006/picture">
+            <wp:extent cx="5486400" cy="3583662"/>
+            <wp:docPr id="8" name="Picture 8"/>
+            <wp:cNvGraphicFramePr>
+              <a:graphicFrameLocks noChangeAspect="1"/>
+            </wp:cNvGraphicFramePr>
+            <a:graphic>
+              <a:graphicData uri="http://schemas.openxmlformats.org/drawingml/2006/picture">
+                <pic:pic>
+                  <pic:nvPicPr>
+                    <pic:cNvPr id="0" name="s03_annotated.png"/>
+                    <pic:cNvPicPr/>
+                  </pic:nvPicPr>
+                  <pic:blipFill>
+                    <a:blip r:embed="rId16"/>
+                    <a:stretch>
+                      <a:fillRect/>
+                    </a:stretch>
+                  </pic:blipFill>
+                  <pic:spPr>
+                    <a:xfrm>
+                      <a:off x="0" y="0"/>
+                      <a:ext cx="5486400" cy="3583662"/>
+                    </a:xfrm>
+                    <a:prstGeom prst="rect"/>
+                  </pic:spPr>
+                </pic:pic>
+              </a:graphicData>
+            </a:graphic>
+          </wp:inline>
+        </w:drawing>
+      </w:r>
+    </w:p>
+    <w:p>
+      <w:pPr>
+        <w:pStyle w:val="Caption"/>
+        <w:jc w:val="center"/>
+      </w:pPr>
+      <w:r>
+        <w:rPr>
+          <w:i/>
+          <w:color w:val="6B6862"/>
+          <w:sz w:val="19"/>
+        </w:rPr>
+        <w:t>Figure 7 — Claude Desktop: Settings → Claude Code → Sessions</w:t>
+      </w:r>
+    </w:p>
+    <w:p>
+      <w:pPr>
+        <w:numPr>
+          <w:ilvl w:val="0"/>
+          <w:numId w:val="18"/>
+        </w:numPr>
+        <w:pStyle w:val="Compact"/>
+      </w:pPr>
+      <w:r>
+        <w:rPr>
+          <w:b/>
+        </w:rPr>
+        <w:t>1 Settings → Claude Code —</w:t>
+      </w:r>
+      <w:r>
+        <w:rPr/>
+        <w:t xml:space="preserve"> open the Claude Code page in Desktop settings.</w:t>
+      </w:r>
+    </w:p>
+    <w:p>
+      <w:pPr>
+        <w:numPr>
+          <w:ilvl w:val="0"/>
+          <w:numId w:val="18"/>
+        </w:numPr>
+        <w:pStyle w:val="Compact"/>
+      </w:pPr>
+      <w:r>
+        <w:rPr>
+          <w:b/>
+        </w:rPr>
+        <w:t>2 Allow bypass permissions mode —</w:t>
+      </w:r>
+      <w:r>
+        <w:rPr/>
+        <w:t xml:space="preserve"> toggle it on to make Bypass available in the mode menu.</w:t>
+      </w:r>
+    </w:p>
+    <w:p>
+      <w:pPr>
+        <w:numPr>
+          <w:ilvl w:val="0"/>
+          <w:numId w:val="18"/>
+        </w:numPr>
+        <w:pStyle w:val="Compact"/>
+      </w:pPr>
+      <w:r>
+        <w:rPr>
+          <w:b/>
+        </w:rPr>
+        <w:t>3 Keep computer awake (optional) —</w:t>
+      </w:r>
+      <w:r>
+        <w:rPr/>
+        <w:t xml:space="preserve"> stops the machine sleeping during long runs.</w:t>
       </w:r>
     </w:p>
     <w:p>
@@ -4592,6 +5459,9 @@
       <w:r>
         <w:t xml:space="preserve">). Use this only in a trusted/sandboxed project.</w:t>
       </w:r>
+      <w:r>
+        <w:t xml:space="preserve"> See Figures 6–7 in section 1.9.</w:t>
+      </w:r>
     </w:p>
     <w:p>
       <w:pPr>
@@ -4702,7 +5572,476 @@
         <w:rPr>
           <w:b/>
         </w:rPr>
-        <w:t xml:space="preserve">Step 5 — Commit to GitHub:</w:t>
+        <w:t>Step 5 — Commit to GitHub.</w:t>
+      </w:r>
+      <w:r>
+        <w:rPr/>
+        <w:t xml:space="preserve"> Create an empty repository on github.com, then let Claude Code push your code.</w:t>
+      </w:r>
+    </w:p>
+    <w:p>
+      <w:pPr>
+        <w:numPr>
+          <w:ilvl w:val="0"/>
+          <w:numId w:val="18"/>
+        </w:numPr>
+        <w:pStyle w:val="Compact"/>
+      </w:pPr>
+      <w:r>
+        <w:rPr>
+          <w:b/>
+        </w:rPr>
+        <w:t>1 Click New —</w:t>
+      </w:r>
+      <w:r>
+        <w:rPr/>
+        <w:t xml:space="preserve"> on github.com go to Repositories and click the green New button.</w:t>
+      </w:r>
+    </w:p>
+    <w:p>
+      <w:pPr>
+        <w:pStyle w:val="BodyText"/>
+        <w:keepNext/>
+        <w:spacing w:before="120"/>
+        <w:jc w:val="center"/>
+      </w:pPr>
+      <w:r>
+        <w:drawing>
+          <wp:inline xmlns:a="http://schemas.openxmlformats.org/drawingml/2006/main" xmlns:pic="http://schemas.openxmlformats.org/drawingml/2006/picture">
+            <wp:extent cx="2194560" cy="1148254"/>
+            <wp:docPr id="9" name="Picture 9"/>
+            <wp:cNvGraphicFramePr>
+              <a:graphicFrameLocks noChangeAspect="1"/>
+            </wp:cNvGraphicFramePr>
+            <a:graphic>
+              <a:graphicData uri="http://schemas.openxmlformats.org/drawingml/2006/picture">
+                <pic:pic>
+                  <pic:nvPicPr>
+                    <pic:cNvPr id="0" name="s09_annotated.png"/>
+                    <pic:cNvPicPr/>
+                  </pic:nvPicPr>
+                  <pic:blipFill>
+                    <a:blip r:embed="rId17"/>
+                    <a:stretch>
+                      <a:fillRect/>
+                    </a:stretch>
+                  </pic:blipFill>
+                  <pic:spPr>
+                    <a:xfrm>
+                      <a:off x="0" y="0"/>
+                      <a:ext cx="2194560" cy="1148254"/>
+                    </a:xfrm>
+                    <a:prstGeom prst="rect"/>
+                  </pic:spPr>
+                </pic:pic>
+              </a:graphicData>
+            </a:graphic>
+          </wp:inline>
+        </w:drawing>
+      </w:r>
+    </w:p>
+    <w:p>
+      <w:pPr>
+        <w:pStyle w:val="Caption"/>
+        <w:jc w:val="center"/>
+      </w:pPr>
+      <w:r>
+        <w:rPr>
+          <w:i/>
+          <w:color w:val="6B6862"/>
+          <w:sz w:val="19"/>
+        </w:rPr>
+        <w:t>Figure 8 — The New repository button on GitHub</w:t>
+      </w:r>
+    </w:p>
+    <w:p>
+      <w:pPr>
+        <w:pStyle w:val="BodyText"/>
+        <w:keepNext/>
+        <w:spacing w:before="120"/>
+        <w:jc w:val="center"/>
+      </w:pPr>
+      <w:r>
+        <w:drawing>
+          <wp:inline xmlns:a="http://schemas.openxmlformats.org/drawingml/2006/main" xmlns:pic="http://schemas.openxmlformats.org/drawingml/2006/picture">
+            <wp:extent cx="5486400" cy="3534908"/>
+            <wp:docPr id="10" name="Picture 10"/>
+            <wp:cNvGraphicFramePr>
+              <a:graphicFrameLocks noChangeAspect="1"/>
+            </wp:cNvGraphicFramePr>
+            <a:graphic>
+              <a:graphicData uri="http://schemas.openxmlformats.org/drawingml/2006/picture">
+                <pic:pic>
+                  <pic:nvPicPr>
+                    <pic:cNvPr id="0" name="s10_annotated.png"/>
+                    <pic:cNvPicPr/>
+                  </pic:nvPicPr>
+                  <pic:blipFill>
+                    <a:blip r:embed="rId18"/>
+                    <a:stretch>
+                      <a:fillRect/>
+                    </a:stretch>
+                  </pic:blipFill>
+                  <pic:spPr>
+                    <a:xfrm>
+                      <a:off x="0" y="0"/>
+                      <a:ext cx="5486400" cy="3534908"/>
+                    </a:xfrm>
+                    <a:prstGeom prst="rect"/>
+                  </pic:spPr>
+                </pic:pic>
+              </a:graphicData>
+            </a:graphic>
+          </wp:inline>
+        </w:drawing>
+      </w:r>
+    </w:p>
+    <w:p>
+      <w:pPr>
+        <w:pStyle w:val="Caption"/>
+        <w:jc w:val="center"/>
+      </w:pPr>
+      <w:r>
+        <w:rPr>
+          <w:i/>
+          <w:color w:val="6B6862"/>
+          <w:sz w:val="19"/>
+        </w:rPr>
+        <w:t>Figure 9 — Create a new repository — owner, name and description</w:t>
+      </w:r>
+    </w:p>
+    <w:p>
+      <w:pPr>
+        <w:numPr>
+          <w:ilvl w:val="0"/>
+          <w:numId w:val="18"/>
+        </w:numPr>
+        <w:pStyle w:val="Compact"/>
+      </w:pPr>
+      <w:r>
+        <w:rPr>
+          <w:b/>
+        </w:rPr>
+        <w:t>1 Owner —</w:t>
+      </w:r>
+      <w:r>
+        <w:rPr/>
+        <w:t xml:space="preserve"> keep your own GitHub account.</w:t>
+      </w:r>
+    </w:p>
+    <w:p>
+      <w:pPr>
+        <w:numPr>
+          <w:ilvl w:val="0"/>
+          <w:numId w:val="18"/>
+        </w:numPr>
+        <w:pStyle w:val="Compact"/>
+      </w:pPr>
+      <w:r>
+        <w:rPr>
+          <w:b/>
+        </w:rPr>
+        <w:t>2 Repository name —</w:t>
+      </w:r>
+      <w:r>
+        <w:rPr/>
+        <w:t xml:space="preserve"> e.g. software-dev-site (kanban8 in the screenshot); a green tick means the name is free. Use lowercase-with-hyphens — the name becomes part of your GitHub Pages URL.</w:t>
+      </w:r>
+    </w:p>
+    <w:p>
+      <w:pPr>
+        <w:numPr>
+          <w:ilvl w:val="0"/>
+          <w:numId w:val="18"/>
+        </w:numPr>
+        <w:pStyle w:val="Compact"/>
+      </w:pPr>
+      <w:r>
+        <w:rPr>
+          <w:b/>
+        </w:rPr>
+        <w:t>3 Description (optional) —</w:t>
+      </w:r>
+      <w:r>
+        <w:rPr/>
+        <w:t xml:space="preserve"> one line about the project.</w:t>
+      </w:r>
+    </w:p>
+    <w:p>
+      <w:pPr>
+        <w:pStyle w:val="BodyText"/>
+        <w:keepNext/>
+        <w:spacing w:before="120"/>
+        <w:jc w:val="center"/>
+      </w:pPr>
+      <w:r>
+        <w:drawing>
+          <wp:inline xmlns:a="http://schemas.openxmlformats.org/drawingml/2006/main" xmlns:pic="http://schemas.openxmlformats.org/drawingml/2006/picture">
+            <wp:extent cx="5120640" cy="3507840"/>
+            <wp:docPr id="11" name="Picture 11"/>
+            <wp:cNvGraphicFramePr>
+              <a:graphicFrameLocks noChangeAspect="1"/>
+            </wp:cNvGraphicFramePr>
+            <a:graphic>
+              <a:graphicData uri="http://schemas.openxmlformats.org/drawingml/2006/picture">
+                <pic:pic>
+                  <pic:nvPicPr>
+                    <pic:cNvPr id="0" name="s11_annotated.png"/>
+                    <pic:cNvPicPr/>
+                  </pic:nvPicPr>
+                  <pic:blipFill>
+                    <a:blip r:embed="rId19"/>
+                    <a:stretch>
+                      <a:fillRect/>
+                    </a:stretch>
+                  </pic:blipFill>
+                  <pic:spPr>
+                    <a:xfrm>
+                      <a:off x="0" y="0"/>
+                      <a:ext cx="5120640" cy="3507840"/>
+                    </a:xfrm>
+                    <a:prstGeom prst="rect"/>
+                  </pic:spPr>
+                </pic:pic>
+              </a:graphicData>
+            </a:graphic>
+          </wp:inline>
+        </w:drawing>
+      </w:r>
+    </w:p>
+    <w:p>
+      <w:pPr>
+        <w:pStyle w:val="Caption"/>
+        <w:jc w:val="center"/>
+      </w:pPr>
+      <w:r>
+        <w:rPr>
+          <w:i/>
+          <w:color w:val="6B6862"/>
+          <w:sz w:val="19"/>
+        </w:rPr>
+        <w:t>Figure 10 — Configuration — keep the repository empty</w:t>
+      </w:r>
+    </w:p>
+    <w:p>
+      <w:pPr>
+        <w:numPr>
+          <w:ilvl w:val="0"/>
+          <w:numId w:val="18"/>
+        </w:numPr>
+        <w:pStyle w:val="Compact"/>
+      </w:pPr>
+      <w:r>
+        <w:rPr>
+          <w:b/>
+        </w:rPr>
+        <w:t>1 Visibility: Public —</w:t>
+      </w:r>
+      <w:r>
+        <w:rPr/>
+        <w:t xml:space="preserve"> free GitHub Pages hosting needs a public repository.</w:t>
+      </w:r>
+    </w:p>
+    <w:p>
+      <w:pPr>
+        <w:numPr>
+          <w:ilvl w:val="0"/>
+          <w:numId w:val="18"/>
+        </w:numPr>
+        <w:pStyle w:val="Compact"/>
+      </w:pPr>
+      <w:r>
+        <w:rPr>
+          <w:b/>
+        </w:rPr>
+        <w:t>2 No template —</w:t>
+      </w:r>
+      <w:r>
+        <w:rPr/>
+        <w:t xml:space="preserve"> start from a blank repository.</w:t>
+      </w:r>
+    </w:p>
+    <w:p>
+      <w:pPr>
+        <w:numPr>
+          <w:ilvl w:val="0"/>
+          <w:numId w:val="18"/>
+        </w:numPr>
+        <w:pStyle w:val="Compact"/>
+      </w:pPr>
+      <w:r>
+        <w:rPr>
+          <w:b/>
+        </w:rPr>
+        <w:t>3 README: Off —</w:t>
+      </w:r>
+      <w:r>
+        <w:rPr/>
+        <w:t xml:space="preserve"> Claude writes the README in Step 6.</w:t>
+      </w:r>
+    </w:p>
+    <w:p>
+      <w:pPr>
+        <w:numPr>
+          <w:ilvl w:val="0"/>
+          <w:numId w:val="18"/>
+        </w:numPr>
+        <w:pStyle w:val="Compact"/>
+      </w:pPr>
+      <w:r>
+        <w:rPr>
+          <w:b/>
+        </w:rPr>
+        <w:t>4 No .gitignore, no license —</w:t>
+      </w:r>
+      <w:r>
+        <w:rPr/>
+        <w:t xml:space="preserve"> files created here would clash with your first push (the “rejected — fetch first” error).</w:t>
+      </w:r>
+    </w:p>
+    <w:p>
+      <w:pPr>
+        <w:numPr>
+          <w:ilvl w:val="0"/>
+          <w:numId w:val="18"/>
+        </w:numPr>
+        <w:pStyle w:val="Compact"/>
+      </w:pPr>
+      <w:r>
+        <w:rPr>
+          <w:b/>
+        </w:rPr>
+        <w:t>5 Create repository —</w:t>
+      </w:r>
+      <w:r>
+        <w:rPr/>
+        <w:t xml:space="preserve"> click the green button.</w:t>
+      </w:r>
+    </w:p>
+    <w:p>
+      <w:pPr>
+        <w:pStyle w:val="BodyText"/>
+        <w:keepNext/>
+        <w:spacing w:before="120"/>
+        <w:jc w:val="center"/>
+      </w:pPr>
+      <w:r>
+        <w:drawing>
+          <wp:inline xmlns:a="http://schemas.openxmlformats.org/drawingml/2006/main" xmlns:pic="http://schemas.openxmlformats.org/drawingml/2006/picture">
+            <wp:extent cx="5486400" cy="2135406"/>
+            <wp:docPr id="12" name="Picture 12"/>
+            <wp:cNvGraphicFramePr>
+              <a:graphicFrameLocks noChangeAspect="1"/>
+            </wp:cNvGraphicFramePr>
+            <a:graphic>
+              <a:graphicData uri="http://schemas.openxmlformats.org/drawingml/2006/picture">
+                <pic:pic>
+                  <pic:nvPicPr>
+                    <pic:cNvPr id="0" name="s12_annotated.png"/>
+                    <pic:cNvPicPr/>
+                  </pic:nvPicPr>
+                  <pic:blipFill>
+                    <a:blip r:embed="rId20"/>
+                    <a:stretch>
+                      <a:fillRect/>
+                    </a:stretch>
+                  </pic:blipFill>
+                  <pic:spPr>
+                    <a:xfrm>
+                      <a:off x="0" y="0"/>
+                      <a:ext cx="5486400" cy="2135406"/>
+                    </a:xfrm>
+                    <a:prstGeom prst="rect"/>
+                  </pic:spPr>
+                </pic:pic>
+              </a:graphicData>
+            </a:graphic>
+          </wp:inline>
+        </w:drawing>
+      </w:r>
+    </w:p>
+    <w:p>
+      <w:pPr>
+        <w:pStyle w:val="Caption"/>
+        <w:jc w:val="center"/>
+      </w:pPr>
+      <w:r>
+        <w:rPr>
+          <w:i/>
+          <w:color w:val="6B6862"/>
+          <w:sz w:val="19"/>
+        </w:rPr>
+        <w:t>Figure 11 — Quick setup — the repository URL and git commands</w:t>
+      </w:r>
+    </w:p>
+    <w:p>
+      <w:pPr>
+        <w:numPr>
+          <w:ilvl w:val="0"/>
+          <w:numId w:val="18"/>
+        </w:numPr>
+        <w:pStyle w:val="Compact"/>
+      </w:pPr>
+      <w:r>
+        <w:rPr>
+          <w:b/>
+        </w:rPr>
+        <w:t>1 Copy the HTTPS URL —</w:t>
+      </w:r>
+      <w:r>
+        <w:rPr/>
+        <w:t xml:space="preserve"> click the copy icon beside https://github.com/&lt;you&gt;/&lt;repo&gt;.git.</w:t>
+      </w:r>
+    </w:p>
+    <w:p>
+      <w:pPr>
+        <w:numPr>
+          <w:ilvl w:val="0"/>
+          <w:numId w:val="18"/>
+        </w:numPr>
+        <w:pStyle w:val="Compact"/>
+      </w:pPr>
+      <w:r>
+        <w:rPr>
+          <w:b/>
+        </w:rPr>
+        <w:t>2 The git commands —</w:t>
+      </w:r>
+      <w:r>
+        <w:rPr/>
+        <w:t xml:space="preserve"> init → add → commit → branch -M main → remote add origin → push. You don’t need to type them — ask Claude:</w:t>
+      </w:r>
+    </w:p>
+    <w:p>
+      <w:pPr>
+        <w:numPr>
+          <w:ilvl w:val="0"/>
+          <w:numId w:val="25"/>
+        </w:numPr>
+        <w:pStyle w:val="BlockText"/>
+      </w:pPr>
+      <w:r>
+        <w:rPr/>
+        <w:t>Commit all files and push this project to https://github.com/&lt;username&gt;/software-dev-site.git on the main branch.</w:t>
+      </w:r>
+    </w:p>
+    <w:p>
+      <w:pPr>
+        <w:pStyle w:val="BodyText"/>
+      </w:pPr>
+      <w:r>
+        <w:rPr/>
+        <w:t xml:space="preserve">Approve the GitHub sign-in when asked (or run </w:t>
+      </w:r>
+      <w:r>
+        <w:rPr>
+          <w:b/>
+        </w:rPr>
+        <w:t>gh auth login</w:t>
+      </w:r>
+      <w:r>
+        <w:rPr/>
+        <w:t xml:space="preserve"> first), then refresh the repository page — your files appear, ready for Step 6. Prefer the GitHub CLI? This creates the repo and pushes in one go:</w:t>
       </w:r>
     </w:p>
     <w:p>
@@ -10916,6 +12255,7 @@
       </w:r>
     </w:p>
     <w:sectPr>
+      <w:footerReference w:type="default" r:id="rId21"/>
       <w:pgSz w:w="12240" w:h="15840"/>
       <w:pgMar w:top="1080" w:right="1440" w:bottom="1080" w:left="1440" w:header="720" w:footer="720" w:gutter="0"/>
       <w:cols w:space="720"/>
@@ -10923,6 +12263,64 @@
     </w:sectPr>
   </w:body>
 </w:document>
+</file>
+
+<file path=word/footer1.xml><?xml version="1.0" encoding="utf-8"?>
+<w:ftr xmlns:m="http://schemas.openxmlformats.org/officeDocument/2006/math" xmlns:mc="http://schemas.openxmlformats.org/markup-compatibility/2006" xmlns:mo="http://schemas.microsoft.com/office/mac/office/2008/main" xmlns:mv="urn:schemas-microsoft-com:mac:vml" xmlns:o="urn:schemas-microsoft-com:office:office" xmlns:r="http://schemas.openxmlformats.org/officeDocument/2006/relationships" xmlns:v="urn:schemas-microsoft-com:vml" xmlns:w10="urn:schemas-microsoft-com:office:word" xmlns:w14="http://schemas.microsoft.com/office/word/2010/wordml" xmlns:w="http://schemas.openxmlformats.org/wordprocessingml/2006/main" xmlns:wne="http://schemas.microsoft.com/office/word/2006/wordml" xmlns:wp14="http://schemas.microsoft.com/office/word/2010/wordprocessingDrawing" xmlns:wp="http://schemas.openxmlformats.org/drawingml/2006/wordprocessingDrawing" xmlns:wpc="http://schemas.microsoft.com/office/word/2010/wordprocessingCanvas" xmlns:wpg="http://schemas.microsoft.com/office/word/2010/wordprocessingGroup" xmlns:wpi="http://schemas.microsoft.com/office/word/2010/wordprocessingInk" xmlns:wps="http://schemas.microsoft.com/office/word/2010/wordprocessingShape" mc:Ignorable="w14 wp14">
+  <w:p>
+    <w:pPr>
+      <w:pStyle w:val="Footer"/>
+      <w:jc w:val="center"/>
+    </w:pPr>
+    <w:r/>
+    <w:r>
+      <w:rPr>
+        <w:color w:val="555B66"/>
+        <w:sz w:val="18"/>
+      </w:rPr>
+      <w:t xml:space="preserve">Page </w:t>
+    </w:r>
+    <w:r>
+      <w:rPr>
+        <w:sz w:val="18"/>
+      </w:rPr>
+      <w:fldChar w:fldCharType="begin"/>
+      <w:instrText xml:space="preserve">PAGE</w:instrText>
+      <w:fldChar w:fldCharType="separate"/>
+      <w:t>1</w:t>
+      <w:fldChar w:fldCharType="end"/>
+    </w:r>
+    <w:r>
+      <w:rPr>
+        <w:color w:val="555B66"/>
+        <w:sz w:val="18"/>
+      </w:rPr>
+      <w:t xml:space="preserve"> of </w:t>
+    </w:r>
+    <w:r>
+      <w:rPr>
+        <w:sz w:val="18"/>
+      </w:rPr>
+      <w:fldChar w:fldCharType="begin"/>
+      <w:instrText xml:space="preserve">NUMPAGES</w:instrText>
+      <w:fldChar w:fldCharType="separate"/>
+      <w:t>1</w:t>
+      <w:fldChar w:fldCharType="end"/>
+    </w:r>
+  </w:p>
+  <w:p>
+    <w:pPr>
+      <w:jc w:val="center"/>
+    </w:pPr>
+    <w:r>
+      <w:rPr>
+        <w:color w:val="555B66"/>
+        <w:sz w:val="15"/>
+      </w:rPr>
+      <w:t>© 2026 Tertiary Infotech Academy Pte Ltd. All rights reserved.  ·  www.tertiarycourses.com.sg</w:t>
+    </w:r>
+  </w:p>
+</w:ftr>
 </file>
 
 <file path=word/numbering.xml><?xml version="1.0" encoding="utf-8"?>

</xml_diff>

<commit_message>
courseware: v21 — agentic loop after Harness Engineering; setup walkthrough in Activity 1
- Move the agentic-loop block (The Agentic Loop, Why the loop matters,
  Built-in Tools, The Agentic Loop in Action) to slides 19-22, right
  after "What is Harness Engineering?".
- Move the setup walkthrough (Install the Claude Code Extension, Move to
  the Secondary Side Bar, Desktop App) into Activity 1 after "7 Steps to
  Build an App" (slides 29-31).
- Learner Guide: setup figures now sit in Activity 1's step-by-step;
  figures renumbered top to bottom.
- Lesson Plan: Topic 1.1 = 14-27, 33-36; Activity 1 = 28-32, 37, 46-49;
  agentic loop listed before setup, matching the deck.

Co-Authored-By: Claude Opus 5.5 <noreply@anthropic.com>
</commit_message>
<xml_diff>
--- a/courseware/LG-Agentic AI Applications with Claude Code.docx
+++ b/courseware/LG-Agentic AI Applications with Claude Code.docx
@@ -825,7 +825,7 @@
           </w:tcPr>
           <w:p>
             <w:r>
-              <w:t>Aligned with slide deck v21: added annotated screenshots with step-by-step explanations for the Claude Desktop Code tab, installing the VS Code extension and docking it in the secondary side bar (1.4), allowing bypass mode in VS Code and Desktop (1.9), and creating a GitHub repository and pushing with Claude in Activity 1, Step 5.</w:t>
+              <w:t>Aligned with slide deck v21: added annotated screenshots with step-by-step explanations for the Claude Desktop Code tab, installing the VS Code extension and docking it in the secondary side bar (Activity 1 set-up), allowing bypass mode in VS Code and Desktop (1.9), and creating a GitHub repository and pushing with Claude in Activity 1, Step 5. Added a page footer (Page X of Y + copyright).</w:t>
             </w:r>
           </w:p>
         </w:tc>
@@ -2522,597 +2522,6 @@
       </w:r>
       <w:r>
         <w:t xml:space="preserve">a full GUI for parallel sessions, scheduled tasks (Routines), and connectors.</w:t>
-      </w:r>
-    </w:p>
-    <w:p>
-      <w:pPr>
-        <w:pStyle w:val="BodyText"/>
-      </w:pPr>
-      <w:r>
-        <w:rPr>
-          <w:b/>
-        </w:rPr>
-        <w:t xml:space="preserve">Claude Code in the Desktop app. </w:t>
-      </w:r>
-      <w:r>
-        <w:rPr/>
-        <w:t>Prefer a GUI? Open the Claude Desktop app, switch to the Code tab and point it at a project folder — it runs the same agentic loop as the CLI.</w:t>
-      </w:r>
-    </w:p>
-    <w:p>
-      <w:pPr>
-        <w:pStyle w:val="BodyText"/>
-        <w:keepNext/>
-        <w:spacing w:before="120"/>
-        <w:jc w:val="center"/>
-      </w:pPr>
-      <w:r>
-        <w:drawing>
-          <wp:inline xmlns:a="http://schemas.openxmlformats.org/drawingml/2006/main" xmlns:pic="http://schemas.openxmlformats.org/drawingml/2006/picture">
-            <wp:extent cx="5486400" cy="3741023"/>
-            <wp:docPr id="2" name="Picture 2"/>
-            <wp:cNvGraphicFramePr>
-              <a:graphicFrameLocks noChangeAspect="1"/>
-            </wp:cNvGraphicFramePr>
-            <a:graphic>
-              <a:graphicData uri="http://schemas.openxmlformats.org/drawingml/2006/picture">
-                <pic:pic>
-                  <pic:nvPicPr>
-                    <pic:cNvPr id="0" name="s02_annotated.png"/>
-                    <pic:cNvPicPr/>
-                  </pic:nvPicPr>
-                  <pic:blipFill>
-                    <a:blip r:embed="rId10"/>
-                    <a:stretch>
-                      <a:fillRect/>
-                    </a:stretch>
-                  </pic:blipFill>
-                  <pic:spPr>
-                    <a:xfrm>
-                      <a:off x="0" y="0"/>
-                      <a:ext cx="5486400" cy="3741023"/>
-                    </a:xfrm>
-                    <a:prstGeom prst="rect"/>
-                  </pic:spPr>
-                </pic:pic>
-              </a:graphicData>
-            </a:graphic>
-          </wp:inline>
-        </w:drawing>
-      </w:r>
-    </w:p>
-    <w:p>
-      <w:pPr>
-        <w:pStyle w:val="Caption"/>
-        <w:jc w:val="center"/>
-      </w:pPr>
-      <w:r>
-        <w:rPr>
-          <w:i/>
-          <w:color w:val="6B6862"/>
-          <w:sz w:val="19"/>
-        </w:rPr>
-        <w:t>Figure 1 — Claude Code in the Claude Desktop app (Code tab)</w:t>
-      </w:r>
-    </w:p>
-    <w:p>
-      <w:pPr>
-        <w:numPr>
-          <w:ilvl w:val="0"/>
-          <w:numId w:val="18"/>
-        </w:numPr>
-        <w:pStyle w:val="Compact"/>
-      </w:pPr>
-      <w:r>
-        <w:rPr>
-          <w:b/>
-        </w:rPr>
-        <w:t>1 Open the Code tab —</w:t>
-      </w:r>
-      <w:r>
-        <w:rPr/>
-        <w:t xml:space="preserve"> click the &lt;/&gt; icon at the top-left to switch from Chat to Claude Code.</w:t>
-      </w:r>
-    </w:p>
-    <w:p>
-      <w:pPr>
-        <w:numPr>
-          <w:ilvl w:val="0"/>
-          <w:numId w:val="18"/>
-        </w:numPr>
-        <w:pStyle w:val="Compact"/>
-      </w:pPr>
-      <w:r>
-        <w:rPr>
-          <w:b/>
-        </w:rPr>
-        <w:t>2 Choose your project folder —</w:t>
-      </w:r>
-      <w:r>
-        <w:rPr/>
-        <w:t xml:space="preserve"> pick a folder (here kanban8); Claude reads and edits files only inside it.</w:t>
-      </w:r>
-    </w:p>
-    <w:p>
-      <w:pPr>
-        <w:numPr>
-          <w:ilvl w:val="0"/>
-          <w:numId w:val="18"/>
-        </w:numPr>
-        <w:pStyle w:val="Compact"/>
-      </w:pPr>
-      <w:r>
-        <w:rPr>
-          <w:b/>
-        </w:rPr>
-        <w:t>3 Describe the task —</w:t>
-      </w:r>
-      <w:r>
-        <w:rPr/>
-        <w:t xml:space="preserve"> type your goal in plain English and press Enter.</w:t>
-      </w:r>
-    </w:p>
-    <w:p>
-      <w:pPr>
-        <w:numPr>
-          <w:ilvl w:val="0"/>
-          <w:numId w:val="18"/>
-        </w:numPr>
-        <w:pStyle w:val="Compact"/>
-      </w:pPr>
-      <w:r>
-        <w:rPr>
-          <w:b/>
-        </w:rPr>
-        <w:t>4 Check folder, mode &amp; model —</w:t>
-      </w:r>
-      <w:r>
-        <w:rPr/>
-        <w:t xml:space="preserve"> the status bar shows the folder, permission mode (Plan) and model (Sonnet 5.5 · Medium).</w:t>
-      </w:r>
-    </w:p>
-    <w:p>
-      <w:pPr>
-        <w:numPr>
-          <w:ilvl w:val="0"/>
-          <w:numId w:val="18"/>
-        </w:numPr>
-        <w:pStyle w:val="Compact"/>
-      </w:pPr>
-      <w:r>
-        <w:rPr>
-          <w:b/>
-        </w:rPr>
-        <w:t>5 Sessions grouped by project —</w:t>
-      </w:r>
-      <w:r>
-        <w:rPr/>
-        <w:t xml:space="preserve"> the sidebar lists past sessions under each project; click one to resume. “Import Claude Code CLI sessions” brings your terminal history in.</w:t>
-      </w:r>
-    </w:p>
-    <w:p>
-      <w:pPr>
-        <w:pStyle w:val="BodyText"/>
-      </w:pPr>
-      <w:r>
-        <w:rPr>
-          <w:b/>
-        </w:rPr>
-        <w:t xml:space="preserve">Install the Claude Code extension in VS Code. </w:t>
-      </w:r>
-      <w:r>
-        <w:rPr/>
-        <w:t>Install only the official extension published by Anthropic — an extension can read your whole codebase.</w:t>
-      </w:r>
-    </w:p>
-    <w:p>
-      <w:pPr>
-        <w:pStyle w:val="BodyText"/>
-        <w:keepNext/>
-        <w:spacing w:before="120"/>
-        <w:jc w:val="center"/>
-      </w:pPr>
-      <w:r>
-        <w:drawing>
-          <wp:inline xmlns:a="http://schemas.openxmlformats.org/drawingml/2006/main" xmlns:pic="http://schemas.openxmlformats.org/drawingml/2006/picture">
-            <wp:extent cx="5486400" cy="3939287"/>
-            <wp:docPr id="3" name="Picture 3"/>
-            <wp:cNvGraphicFramePr>
-              <a:graphicFrameLocks noChangeAspect="1"/>
-            </wp:cNvGraphicFramePr>
-            <a:graphic>
-              <a:graphicData uri="http://schemas.openxmlformats.org/drawingml/2006/picture">
-                <pic:pic>
-                  <pic:nvPicPr>
-                    <pic:cNvPr id="0" name="s04_annotated.png"/>
-                    <pic:cNvPicPr/>
-                  </pic:nvPicPr>
-                  <pic:blipFill>
-                    <a:blip r:embed="rId11"/>
-                    <a:stretch>
-                      <a:fillRect/>
-                    </a:stretch>
-                  </pic:blipFill>
-                  <pic:spPr>
-                    <a:xfrm>
-                      <a:off x="0" y="0"/>
-                      <a:ext cx="5486400" cy="3939287"/>
-                    </a:xfrm>
-                    <a:prstGeom prst="rect"/>
-                  </pic:spPr>
-                </pic:pic>
-              </a:graphicData>
-            </a:graphic>
-          </wp:inline>
-        </w:drawing>
-      </w:r>
-    </w:p>
-    <w:p>
-      <w:pPr>
-        <w:pStyle w:val="Caption"/>
-        <w:jc w:val="center"/>
-      </w:pPr>
-      <w:r>
-        <w:rPr>
-          <w:i/>
-          <w:color w:val="6B6862"/>
-          <w:sz w:val="19"/>
-        </w:rPr>
-        <w:t>Figure 2 — Installing “Claude Code for VS Code” from the Marketplace</w:t>
-      </w:r>
-    </w:p>
-    <w:p>
-      <w:pPr>
-        <w:numPr>
-          <w:ilvl w:val="0"/>
-          <w:numId w:val="18"/>
-        </w:numPr>
-        <w:pStyle w:val="Compact"/>
-      </w:pPr>
-      <w:r>
-        <w:rPr>
-          <w:b/>
-        </w:rPr>
-        <w:t>1 Open Extensions —</w:t>
-      </w:r>
-      <w:r>
-        <w:rPr/>
-        <w:t xml:space="preserve"> click the Extensions icon or press Ctrl+Shift+X (Cmd+Shift+X on Mac).</w:t>
-      </w:r>
-    </w:p>
-    <w:p>
-      <w:pPr>
-        <w:numPr>
-          <w:ilvl w:val="0"/>
-          <w:numId w:val="18"/>
-        </w:numPr>
-        <w:pStyle w:val="Compact"/>
-      </w:pPr>
-      <w:r>
-        <w:rPr>
-          <w:b/>
-        </w:rPr>
-        <w:t>2 Search “claude” —</w:t>
-      </w:r>
-      <w:r>
-        <w:rPr/>
-        <w:t xml:space="preserve"> type claude in the Marketplace search box.</w:t>
-      </w:r>
-    </w:p>
-    <w:p>
-      <w:pPr>
-        <w:numPr>
-          <w:ilvl w:val="0"/>
-          <w:numId w:val="18"/>
-        </w:numPr>
-        <w:pStyle w:val="Compact"/>
-      </w:pPr>
-      <w:r>
-        <w:rPr>
-          <w:b/>
-        </w:rPr>
-        <w:t>3 Pick “Claude Code for VS Code” —</w:t>
-      </w:r>
-      <w:r>
-        <w:rPr/>
-        <w:t xml:space="preserve"> select the result published by Anthropic.</w:t>
-      </w:r>
-    </w:p>
-    <w:p>
-      <w:pPr>
-        <w:numPr>
-          <w:ilvl w:val="0"/>
-          <w:numId w:val="18"/>
-        </w:numPr>
-        <w:pStyle w:val="Compact"/>
-      </w:pPr>
-      <w:r>
-        <w:rPr>
-          <w:b/>
-        </w:rPr>
-        <w:t>4 Check the publisher —</w:t>
-      </w:r>
-      <w:r>
-        <w:rPr/>
-        <w:t xml:space="preserve"> look for the blue verified tick and anthropic.com; skip look-alike extensions.</w:t>
-      </w:r>
-    </w:p>
-    <w:p>
-      <w:pPr>
-        <w:numPr>
-          <w:ilvl w:val="0"/>
-          <w:numId w:val="18"/>
-        </w:numPr>
-        <w:pStyle w:val="Compact"/>
-      </w:pPr>
-      <w:r>
-        <w:rPr>
-          <w:b/>
-        </w:rPr>
-        <w:t>5 Install &amp; keep it updated —</w:t>
-      </w:r>
-      <w:r>
-        <w:rPr/>
-        <w:t xml:space="preserve"> click Install and leave Auto Update ticked.</w:t>
-      </w:r>
-    </w:p>
-    <w:p>
-      <w:pPr>
-        <w:pStyle w:val="BodyText"/>
-      </w:pPr>
-      <w:r>
-        <w:rPr>
-          <w:b/>
-        </w:rPr>
-        <w:t xml:space="preserve">Move Claude Code to the secondary side bar. </w:t>
-      </w:r>
-      <w:r>
-        <w:rPr/>
-        <w:t>Right-click the Claude icon → Move To → Secondary Side Bar. Your files stay on the left, the editor in the middle and Claude Code on the right.</w:t>
-      </w:r>
-    </w:p>
-    <w:p>
-      <w:pPr>
-        <w:pStyle w:val="BodyText"/>
-        <w:keepNext/>
-        <w:spacing w:before="120"/>
-        <w:jc w:val="center"/>
-      </w:pPr>
-      <w:r>
-        <w:drawing>
-          <wp:inline xmlns:a="http://schemas.openxmlformats.org/drawingml/2006/main" xmlns:pic="http://schemas.openxmlformats.org/drawingml/2006/picture">
-            <wp:extent cx="3840480" cy="453600"/>
-            <wp:docPr id="4" name="Picture 4"/>
-            <wp:cNvGraphicFramePr>
-              <a:graphicFrameLocks noChangeAspect="1"/>
-            </wp:cNvGraphicFramePr>
-            <a:graphic>
-              <a:graphicData uri="http://schemas.openxmlformats.org/drawingml/2006/picture">
-                <pic:pic>
-                  <pic:nvPicPr>
-                    <pic:cNvPr id="0" name="s05_annotated.png"/>
-                    <pic:cNvPicPr/>
-                  </pic:nvPicPr>
-                  <pic:blipFill>
-                    <a:blip r:embed="rId12"/>
-                    <a:stretch>
-                      <a:fillRect/>
-                    </a:stretch>
-                  </pic:blipFill>
-                  <pic:spPr>
-                    <a:xfrm>
-                      <a:off x="0" y="0"/>
-                      <a:ext cx="3840480" cy="453600"/>
-                    </a:xfrm>
-                    <a:prstGeom prst="rect"/>
-                  </pic:spPr>
-                </pic:pic>
-              </a:graphicData>
-            </a:graphic>
-          </wp:inline>
-        </w:drawing>
-      </w:r>
-    </w:p>
-    <w:p>
-      <w:pPr>
-        <w:pStyle w:val="Caption"/>
-        <w:jc w:val="center"/>
-      </w:pPr>
-      <w:r>
-        <w:rPr>
-          <w:i/>
-          <w:color w:val="6B6862"/>
-          <w:sz w:val="19"/>
-        </w:rPr>
-        <w:t>Figure 3 — Right-click the Claude icon → Move To → Secondary Side Bar</w:t>
-      </w:r>
-    </w:p>
-    <w:p>
-      <w:pPr>
-        <w:pStyle w:val="BodyText"/>
-        <w:keepNext/>
-        <w:spacing w:before="120"/>
-        <w:jc w:val="center"/>
-      </w:pPr>
-      <w:r>
-        <w:drawing>
-          <wp:inline xmlns:a="http://schemas.openxmlformats.org/drawingml/2006/main" xmlns:pic="http://schemas.openxmlformats.org/drawingml/2006/picture">
-            <wp:extent cx="5486400" cy="3337993"/>
-            <wp:docPr id="5" name="Picture 5"/>
-            <wp:cNvGraphicFramePr>
-              <a:graphicFrameLocks noChangeAspect="1"/>
-            </wp:cNvGraphicFramePr>
-            <a:graphic>
-              <a:graphicData uri="http://schemas.openxmlformats.org/drawingml/2006/picture">
-                <pic:pic>
-                  <pic:nvPicPr>
-                    <pic:cNvPr id="0" name="s06_annotated.png"/>
-                    <pic:cNvPicPr/>
-                  </pic:nvPicPr>
-                  <pic:blipFill>
-                    <a:blip r:embed="rId13"/>
-                    <a:stretch>
-                      <a:fillRect/>
-                    </a:stretch>
-                  </pic:blipFill>
-                  <pic:spPr>
-                    <a:xfrm>
-                      <a:off x="0" y="0"/>
-                      <a:ext cx="5486400" cy="3337993"/>
-                    </a:xfrm>
-                    <a:prstGeom prst="rect"/>
-                  </pic:spPr>
-                </pic:pic>
-              </a:graphicData>
-            </a:graphic>
-          </wp:inline>
-        </w:drawing>
-      </w:r>
-    </w:p>
-    <w:p>
-      <w:pPr>
-        <w:pStyle w:val="Caption"/>
-        <w:jc w:val="center"/>
-      </w:pPr>
-      <w:r>
-        <w:rPr>
-          <w:i/>
-          <w:color w:val="6B6862"/>
-          <w:sz w:val="19"/>
-        </w:rPr>
-        <w:t>Figure 4 — VS Code with Claude Code docked in the secondary side bar</w:t>
-      </w:r>
-    </w:p>
-    <w:p>
-      <w:pPr>
-        <w:numPr>
-          <w:ilvl w:val="0"/>
-          <w:numId w:val="18"/>
-        </w:numPr>
-        <w:pStyle w:val="Compact"/>
-      </w:pPr>
-      <w:r>
-        <w:rPr>
-          <w:b/>
-        </w:rPr>
-        <w:t>1 Files on the left —</w:t>
-      </w:r>
-      <w:r>
-        <w:rPr/>
-        <w:t xml:space="preserve"> the Explorer shows your project folder (kanban8).</w:t>
-      </w:r>
-    </w:p>
-    <w:p>
-      <w:pPr>
-        <w:numPr>
-          <w:ilvl w:val="0"/>
-          <w:numId w:val="18"/>
-        </w:numPr>
-        <w:pStyle w:val="Compact"/>
-      </w:pPr>
-      <w:r>
-        <w:rPr>
-          <w:b/>
-        </w:rPr>
-        <w:t>2 Claude Code on the right —</w:t>
-      </w:r>
-      <w:r>
-        <w:rPr/>
-        <w:t xml:space="preserve"> chat with Claude while you watch files change in the editor.</w:t>
-      </w:r>
-    </w:p>
-    <w:p>
-      <w:pPr>
-        <w:numPr>
-          <w:ilvl w:val="0"/>
-          <w:numId w:val="18"/>
-        </w:numPr>
-        <w:pStyle w:val="Compact"/>
-      </w:pPr>
-      <w:r>
-        <w:rPr>
-          <w:b/>
-        </w:rPr>
-        <w:t>3 New session &amp; history —</w:t>
-      </w:r>
-      <w:r>
-        <w:rPr/>
-        <w:t xml:space="preserve"> + starts a fresh session (Figure 5); the clock icon reopens past sessions.</w:t>
-      </w:r>
-    </w:p>
-    <w:p>
-      <w:pPr>
-        <w:numPr>
-          <w:ilvl w:val="0"/>
-          <w:numId w:val="18"/>
-        </w:numPr>
-        <w:pStyle w:val="Compact"/>
-      </w:pPr>
-      <w:r>
-        <w:rPr>
-          <w:b/>
-        </w:rPr>
-        <w:t>4 Prompt box —</w:t>
-      </w:r>
-      <w:r>
-        <w:rPr/>
-        <w:t xml:space="preserve"> Ctrl+Esc focuses Claude; / opens commands; choose Plan mode and the model here.</w:t>
-      </w:r>
-    </w:p>
-    <w:p>
-      <w:pPr>
-        <w:pStyle w:val="BodyText"/>
-        <w:keepNext/>
-        <w:spacing w:before="120"/>
-        <w:jc w:val="center"/>
-      </w:pPr>
-      <w:r>
-        <w:drawing>
-          <wp:inline xmlns:a="http://schemas.openxmlformats.org/drawingml/2006/main" xmlns:pic="http://schemas.openxmlformats.org/drawingml/2006/picture">
-            <wp:extent cx="1645920" cy="908733"/>
-            <wp:docPr id="6" name="Picture 6"/>
-            <wp:cNvGraphicFramePr>
-              <a:graphicFrameLocks noChangeAspect="1"/>
-            </wp:cNvGraphicFramePr>
-            <a:graphic>
-              <a:graphicData uri="http://schemas.openxmlformats.org/drawingml/2006/picture">
-                <pic:pic>
-                  <pic:nvPicPr>
-                    <pic:cNvPr id="0" name="s08_annotated.png"/>
-                    <pic:cNvPicPr/>
-                  </pic:nvPicPr>
-                  <pic:blipFill>
-                    <a:blip r:embed="rId14"/>
-                    <a:stretch>
-                      <a:fillRect/>
-                    </a:stretch>
-                  </pic:blipFill>
-                  <pic:spPr>
-                    <a:xfrm>
-                      <a:off x="0" y="0"/>
-                      <a:ext cx="1645920" cy="908733"/>
-                    </a:xfrm>
-                    <a:prstGeom prst="rect"/>
-                  </pic:spPr>
-                </pic:pic>
-              </a:graphicData>
-            </a:graphic>
-          </wp:inline>
-        </w:drawing>
-      </w:r>
-    </w:p>
-    <w:p>
-      <w:pPr>
-        <w:pStyle w:val="Caption"/>
-        <w:jc w:val="center"/>
-      </w:pPr>
-      <w:r>
-        <w:rPr>
-          <w:i/>
-          <w:color w:val="6B6862"/>
-          <w:sz w:val="19"/>
-        </w:rPr>
-        <w:t>Figure 5 — The New session button</w:t>
       </w:r>
     </w:p>
     <w:p>
@@ -4227,7 +3636,7 @@
         <w:drawing>
           <wp:inline xmlns:a="http://schemas.openxmlformats.org/drawingml/2006/main" xmlns:pic="http://schemas.openxmlformats.org/drawingml/2006/picture">
             <wp:extent cx="2926080" cy="3277712"/>
-            <wp:docPr id="7" name="Picture 7"/>
+            <wp:docPr id="2" name="Picture 2"/>
             <wp:cNvGraphicFramePr>
               <a:graphicFrameLocks noChangeAspect="1"/>
             </wp:cNvGraphicFramePr>
@@ -4239,7 +3648,7 @@
                     <pic:cNvPicPr/>
                   </pic:nvPicPr>
                   <pic:blipFill>
-                    <a:blip r:embed="rId15"/>
+                    <a:blip r:embed="rId10"/>
                     <a:stretch>
                       <a:fillRect/>
                     </a:stretch>
@@ -4269,7 +3678,7 @@
           <w:color w:val="6B6862"/>
           <w:sz w:val="19"/>
         </w:rPr>
-        <w:t>Figure 6 — VS Code: gear icon → Settings</w:t>
+        <w:t>Figure 1 — VS Code: gear icon → Settings</w:t>
       </w:r>
     </w:p>
     <w:p>
@@ -4321,7 +3730,7 @@
         <w:drawing>
           <wp:inline xmlns:a="http://schemas.openxmlformats.org/drawingml/2006/main" xmlns:pic="http://schemas.openxmlformats.org/drawingml/2006/picture">
             <wp:extent cx="5486400" cy="3583662"/>
-            <wp:docPr id="8" name="Picture 8"/>
+            <wp:docPr id="3" name="Picture 3"/>
             <wp:cNvGraphicFramePr>
               <a:graphicFrameLocks noChangeAspect="1"/>
             </wp:cNvGraphicFramePr>
@@ -4333,7 +3742,7 @@
                     <pic:cNvPicPr/>
                   </pic:nvPicPr>
                   <pic:blipFill>
-                    <a:blip r:embed="rId16"/>
+                    <a:blip r:embed="rId11"/>
                     <a:stretch>
                       <a:fillRect/>
                     </a:stretch>
@@ -4363,7 +3772,7 @@
           <w:color w:val="6B6862"/>
           <w:sz w:val="19"/>
         </w:rPr>
-        <w:t>Figure 7 — Claude Desktop: Settings → Claude Code → Sessions</w:t>
+        <w:t>Figure 2 — Claude Desktop: Settings → Claude Code → Sessions</w:t>
       </w:r>
     </w:p>
     <w:p>
@@ -5316,6 +4725,612 @@
     </w:p>
     <w:p>
       <w:pPr>
+        <w:pStyle w:val="BodyText"/>
+      </w:pPr>
+      <w:r>
+        <w:rPr>
+          <w:b/>
+        </w:rPr>
+        <w:t xml:space="preserve">Get set up in VS Code. </w:t>
+      </w:r>
+      <w:r>
+        <w:rPr/>
+        <w:t>Before Step 1, install the extension and dock Claude Code beside your files.</w:t>
+      </w:r>
+    </w:p>
+    <w:p>
+      <w:pPr>
+        <w:pStyle w:val="BodyText"/>
+      </w:pPr>
+      <w:r>
+        <w:rPr>
+          <w:b/>
+        </w:rPr>
+        <w:t xml:space="preserve">Install the Claude Code extension in VS Code. </w:t>
+      </w:r>
+      <w:r>
+        <w:rPr/>
+        <w:t>Install only the official extension published by Anthropic — an extension can read your whole codebase.</w:t>
+      </w:r>
+    </w:p>
+    <w:p>
+      <w:pPr>
+        <w:pStyle w:val="BodyText"/>
+        <w:keepNext/>
+        <w:spacing w:before="120"/>
+        <w:jc w:val="center"/>
+      </w:pPr>
+      <w:r>
+        <w:drawing>
+          <wp:inline xmlns:a="http://schemas.openxmlformats.org/drawingml/2006/main" xmlns:pic="http://schemas.openxmlformats.org/drawingml/2006/picture">
+            <wp:extent cx="5486400" cy="3939287"/>
+            <wp:docPr id="4" name="Picture 4"/>
+            <wp:cNvGraphicFramePr>
+              <a:graphicFrameLocks noChangeAspect="1"/>
+            </wp:cNvGraphicFramePr>
+            <a:graphic>
+              <a:graphicData uri="http://schemas.openxmlformats.org/drawingml/2006/picture">
+                <pic:pic>
+                  <pic:nvPicPr>
+                    <pic:cNvPr id="0" name="s04_annotated.png"/>
+                    <pic:cNvPicPr/>
+                  </pic:nvPicPr>
+                  <pic:blipFill>
+                    <a:blip r:embed="rId12"/>
+                    <a:stretch>
+                      <a:fillRect/>
+                    </a:stretch>
+                  </pic:blipFill>
+                  <pic:spPr>
+                    <a:xfrm>
+                      <a:off x="0" y="0"/>
+                      <a:ext cx="5486400" cy="3939287"/>
+                    </a:xfrm>
+                    <a:prstGeom prst="rect"/>
+                  </pic:spPr>
+                </pic:pic>
+              </a:graphicData>
+            </a:graphic>
+          </wp:inline>
+        </w:drawing>
+      </w:r>
+    </w:p>
+    <w:p>
+      <w:pPr>
+        <w:pStyle w:val="Caption"/>
+        <w:jc w:val="center"/>
+      </w:pPr>
+      <w:r>
+        <w:rPr>
+          <w:i/>
+          <w:color w:val="6B6862"/>
+          <w:sz w:val="19"/>
+        </w:rPr>
+        <w:t>Figure 3 — Installing “Claude Code for VS Code” from the Marketplace</w:t>
+      </w:r>
+    </w:p>
+    <w:p>
+      <w:pPr>
+        <w:numPr>
+          <w:ilvl w:val="0"/>
+          <w:numId w:val="18"/>
+        </w:numPr>
+        <w:pStyle w:val="Compact"/>
+      </w:pPr>
+      <w:r>
+        <w:rPr>
+          <w:b/>
+        </w:rPr>
+        <w:t>1 Open Extensions —</w:t>
+      </w:r>
+      <w:r>
+        <w:rPr/>
+        <w:t xml:space="preserve"> click the Extensions icon or press Ctrl+Shift+X (Cmd+Shift+X on Mac).</w:t>
+      </w:r>
+    </w:p>
+    <w:p>
+      <w:pPr>
+        <w:numPr>
+          <w:ilvl w:val="0"/>
+          <w:numId w:val="18"/>
+        </w:numPr>
+        <w:pStyle w:val="Compact"/>
+      </w:pPr>
+      <w:r>
+        <w:rPr>
+          <w:b/>
+        </w:rPr>
+        <w:t>2 Search “claude” —</w:t>
+      </w:r>
+      <w:r>
+        <w:rPr/>
+        <w:t xml:space="preserve"> type claude in the Marketplace search box.</w:t>
+      </w:r>
+    </w:p>
+    <w:p>
+      <w:pPr>
+        <w:numPr>
+          <w:ilvl w:val="0"/>
+          <w:numId w:val="18"/>
+        </w:numPr>
+        <w:pStyle w:val="Compact"/>
+      </w:pPr>
+      <w:r>
+        <w:rPr>
+          <w:b/>
+        </w:rPr>
+        <w:t>3 Pick “Claude Code for VS Code” —</w:t>
+      </w:r>
+      <w:r>
+        <w:rPr/>
+        <w:t xml:space="preserve"> select the result published by Anthropic.</w:t>
+      </w:r>
+    </w:p>
+    <w:p>
+      <w:pPr>
+        <w:numPr>
+          <w:ilvl w:val="0"/>
+          <w:numId w:val="18"/>
+        </w:numPr>
+        <w:pStyle w:val="Compact"/>
+      </w:pPr>
+      <w:r>
+        <w:rPr>
+          <w:b/>
+        </w:rPr>
+        <w:t>4 Check the publisher —</w:t>
+      </w:r>
+      <w:r>
+        <w:rPr/>
+        <w:t xml:space="preserve"> look for the blue verified tick and anthropic.com; skip look-alike extensions.</w:t>
+      </w:r>
+    </w:p>
+    <w:p>
+      <w:pPr>
+        <w:numPr>
+          <w:ilvl w:val="0"/>
+          <w:numId w:val="18"/>
+        </w:numPr>
+        <w:pStyle w:val="Compact"/>
+      </w:pPr>
+      <w:r>
+        <w:rPr>
+          <w:b/>
+        </w:rPr>
+        <w:t>5 Install &amp; keep it updated —</w:t>
+      </w:r>
+      <w:r>
+        <w:rPr/>
+        <w:t xml:space="preserve"> click Install and leave Auto Update ticked.</w:t>
+      </w:r>
+    </w:p>
+    <w:p>
+      <w:pPr>
+        <w:pStyle w:val="BodyText"/>
+      </w:pPr>
+      <w:r>
+        <w:rPr>
+          <w:b/>
+        </w:rPr>
+        <w:t xml:space="preserve">Move Claude Code to the secondary side bar. </w:t>
+      </w:r>
+      <w:r>
+        <w:rPr/>
+        <w:t>Right-click the Claude icon → Move To → Secondary Side Bar. Your files stay on the left, the editor in the middle and Claude Code on the right.</w:t>
+      </w:r>
+    </w:p>
+    <w:p>
+      <w:pPr>
+        <w:pStyle w:val="BodyText"/>
+        <w:keepNext/>
+        <w:spacing w:before="120"/>
+        <w:jc w:val="center"/>
+      </w:pPr>
+      <w:r>
+        <w:drawing>
+          <wp:inline xmlns:a="http://schemas.openxmlformats.org/drawingml/2006/main" xmlns:pic="http://schemas.openxmlformats.org/drawingml/2006/picture">
+            <wp:extent cx="3840480" cy="453600"/>
+            <wp:docPr id="5" name="Picture 5"/>
+            <wp:cNvGraphicFramePr>
+              <a:graphicFrameLocks noChangeAspect="1"/>
+            </wp:cNvGraphicFramePr>
+            <a:graphic>
+              <a:graphicData uri="http://schemas.openxmlformats.org/drawingml/2006/picture">
+                <pic:pic>
+                  <pic:nvPicPr>
+                    <pic:cNvPr id="0" name="s05_annotated.png"/>
+                    <pic:cNvPicPr/>
+                  </pic:nvPicPr>
+                  <pic:blipFill>
+                    <a:blip r:embed="rId13"/>
+                    <a:stretch>
+                      <a:fillRect/>
+                    </a:stretch>
+                  </pic:blipFill>
+                  <pic:spPr>
+                    <a:xfrm>
+                      <a:off x="0" y="0"/>
+                      <a:ext cx="3840480" cy="453600"/>
+                    </a:xfrm>
+                    <a:prstGeom prst="rect"/>
+                  </pic:spPr>
+                </pic:pic>
+              </a:graphicData>
+            </a:graphic>
+          </wp:inline>
+        </w:drawing>
+      </w:r>
+    </w:p>
+    <w:p>
+      <w:pPr>
+        <w:pStyle w:val="Caption"/>
+        <w:jc w:val="center"/>
+      </w:pPr>
+      <w:r>
+        <w:rPr>
+          <w:i/>
+          <w:color w:val="6B6862"/>
+          <w:sz w:val="19"/>
+        </w:rPr>
+        <w:t>Figure 4 — Right-click the Claude icon → Move To → Secondary Side Bar</w:t>
+      </w:r>
+    </w:p>
+    <w:p>
+      <w:pPr>
+        <w:pStyle w:val="BodyText"/>
+        <w:keepNext/>
+        <w:spacing w:before="120"/>
+        <w:jc w:val="center"/>
+      </w:pPr>
+      <w:r>
+        <w:drawing>
+          <wp:inline xmlns:a="http://schemas.openxmlformats.org/drawingml/2006/main" xmlns:pic="http://schemas.openxmlformats.org/drawingml/2006/picture">
+            <wp:extent cx="5486400" cy="3337993"/>
+            <wp:docPr id="6" name="Picture 6"/>
+            <wp:cNvGraphicFramePr>
+              <a:graphicFrameLocks noChangeAspect="1"/>
+            </wp:cNvGraphicFramePr>
+            <a:graphic>
+              <a:graphicData uri="http://schemas.openxmlformats.org/drawingml/2006/picture">
+                <pic:pic>
+                  <pic:nvPicPr>
+                    <pic:cNvPr id="0" name="s06_annotated.png"/>
+                    <pic:cNvPicPr/>
+                  </pic:nvPicPr>
+                  <pic:blipFill>
+                    <a:blip r:embed="rId14"/>
+                    <a:stretch>
+                      <a:fillRect/>
+                    </a:stretch>
+                  </pic:blipFill>
+                  <pic:spPr>
+                    <a:xfrm>
+                      <a:off x="0" y="0"/>
+                      <a:ext cx="5486400" cy="3337993"/>
+                    </a:xfrm>
+                    <a:prstGeom prst="rect"/>
+                  </pic:spPr>
+                </pic:pic>
+              </a:graphicData>
+            </a:graphic>
+          </wp:inline>
+        </w:drawing>
+      </w:r>
+    </w:p>
+    <w:p>
+      <w:pPr>
+        <w:pStyle w:val="Caption"/>
+        <w:jc w:val="center"/>
+      </w:pPr>
+      <w:r>
+        <w:rPr>
+          <w:i/>
+          <w:color w:val="6B6862"/>
+          <w:sz w:val="19"/>
+        </w:rPr>
+        <w:t>Figure 5 — VS Code with Claude Code docked in the secondary side bar</w:t>
+      </w:r>
+    </w:p>
+    <w:p>
+      <w:pPr>
+        <w:numPr>
+          <w:ilvl w:val="0"/>
+          <w:numId w:val="18"/>
+        </w:numPr>
+        <w:pStyle w:val="Compact"/>
+      </w:pPr>
+      <w:r>
+        <w:rPr>
+          <w:b/>
+        </w:rPr>
+        <w:t>1 Files on the left —</w:t>
+      </w:r>
+      <w:r>
+        <w:rPr/>
+        <w:t xml:space="preserve"> the Explorer shows your project folder (kanban8).</w:t>
+      </w:r>
+    </w:p>
+    <w:p>
+      <w:pPr>
+        <w:numPr>
+          <w:ilvl w:val="0"/>
+          <w:numId w:val="18"/>
+        </w:numPr>
+        <w:pStyle w:val="Compact"/>
+      </w:pPr>
+      <w:r>
+        <w:rPr>
+          <w:b/>
+        </w:rPr>
+        <w:t>2 Claude Code on the right —</w:t>
+      </w:r>
+      <w:r>
+        <w:rPr/>
+        <w:t xml:space="preserve"> chat with Claude while you watch files change in the editor.</w:t>
+      </w:r>
+    </w:p>
+    <w:p>
+      <w:pPr>
+        <w:numPr>
+          <w:ilvl w:val="0"/>
+          <w:numId w:val="18"/>
+        </w:numPr>
+        <w:pStyle w:val="Compact"/>
+      </w:pPr>
+      <w:r>
+        <w:rPr>
+          <w:b/>
+        </w:rPr>
+        <w:t>3 New session &amp; history —</w:t>
+      </w:r>
+      <w:r>
+        <w:rPr/>
+        <w:t xml:space="preserve"> + starts a fresh session (Figure 6); the clock icon reopens past sessions.</w:t>
+      </w:r>
+    </w:p>
+    <w:p>
+      <w:pPr>
+        <w:numPr>
+          <w:ilvl w:val="0"/>
+          <w:numId w:val="18"/>
+        </w:numPr>
+        <w:pStyle w:val="Compact"/>
+      </w:pPr>
+      <w:r>
+        <w:rPr>
+          <w:b/>
+        </w:rPr>
+        <w:t>4 Prompt box —</w:t>
+      </w:r>
+      <w:r>
+        <w:rPr/>
+        <w:t xml:space="preserve"> Ctrl+Esc focuses Claude; / opens commands; choose Plan mode and the model here.</w:t>
+      </w:r>
+    </w:p>
+    <w:p>
+      <w:pPr>
+        <w:pStyle w:val="BodyText"/>
+        <w:keepNext/>
+        <w:spacing w:before="120"/>
+        <w:jc w:val="center"/>
+      </w:pPr>
+      <w:r>
+        <w:drawing>
+          <wp:inline xmlns:a="http://schemas.openxmlformats.org/drawingml/2006/main" xmlns:pic="http://schemas.openxmlformats.org/drawingml/2006/picture">
+            <wp:extent cx="1645920" cy="908733"/>
+            <wp:docPr id="7" name="Picture 7"/>
+            <wp:cNvGraphicFramePr>
+              <a:graphicFrameLocks noChangeAspect="1"/>
+            </wp:cNvGraphicFramePr>
+            <a:graphic>
+              <a:graphicData uri="http://schemas.openxmlformats.org/drawingml/2006/picture">
+                <pic:pic>
+                  <pic:nvPicPr>
+                    <pic:cNvPr id="0" name="s08_annotated.png"/>
+                    <pic:cNvPicPr/>
+                  </pic:nvPicPr>
+                  <pic:blipFill>
+                    <a:blip r:embed="rId15"/>
+                    <a:stretch>
+                      <a:fillRect/>
+                    </a:stretch>
+                  </pic:blipFill>
+                  <pic:spPr>
+                    <a:xfrm>
+                      <a:off x="0" y="0"/>
+                      <a:ext cx="1645920" cy="908733"/>
+                    </a:xfrm>
+                    <a:prstGeom prst="rect"/>
+                  </pic:spPr>
+                </pic:pic>
+              </a:graphicData>
+            </a:graphic>
+          </wp:inline>
+        </w:drawing>
+      </w:r>
+    </w:p>
+    <w:p>
+      <w:pPr>
+        <w:pStyle w:val="Caption"/>
+        <w:jc w:val="center"/>
+      </w:pPr>
+      <w:r>
+        <w:rPr>
+          <w:i/>
+          <w:color w:val="6B6862"/>
+          <w:sz w:val="19"/>
+        </w:rPr>
+        <w:t>Figure 6 — The New session button</w:t>
+      </w:r>
+    </w:p>
+    <w:p>
+      <w:pPr>
+        <w:pStyle w:val="BodyText"/>
+      </w:pPr>
+      <w:r>
+        <w:rPr>
+          <w:b/>
+        </w:rPr>
+        <w:t xml:space="preserve">Or use the Claude Desktop app. </w:t>
+      </w:r>
+      <w:r>
+        <w:rPr/>
+        <w:t>Prefer a GUI? Open the Claude Desktop app, switch to the Code tab and point it at a project folder — it runs the same agentic loop as the CLI.</w:t>
+      </w:r>
+    </w:p>
+    <w:p>
+      <w:pPr>
+        <w:pStyle w:val="BodyText"/>
+        <w:keepNext/>
+        <w:spacing w:before="120"/>
+        <w:jc w:val="center"/>
+      </w:pPr>
+      <w:r>
+        <w:drawing>
+          <wp:inline xmlns:a="http://schemas.openxmlformats.org/drawingml/2006/main" xmlns:pic="http://schemas.openxmlformats.org/drawingml/2006/picture">
+            <wp:extent cx="5486400" cy="3741023"/>
+            <wp:docPr id="8" name="Picture 8"/>
+            <wp:cNvGraphicFramePr>
+              <a:graphicFrameLocks noChangeAspect="1"/>
+            </wp:cNvGraphicFramePr>
+            <a:graphic>
+              <a:graphicData uri="http://schemas.openxmlformats.org/drawingml/2006/picture">
+                <pic:pic>
+                  <pic:nvPicPr>
+                    <pic:cNvPr id="0" name="s02_annotated.png"/>
+                    <pic:cNvPicPr/>
+                  </pic:nvPicPr>
+                  <pic:blipFill>
+                    <a:blip r:embed="rId16"/>
+                    <a:stretch>
+                      <a:fillRect/>
+                    </a:stretch>
+                  </pic:blipFill>
+                  <pic:spPr>
+                    <a:xfrm>
+                      <a:off x="0" y="0"/>
+                      <a:ext cx="5486400" cy="3741023"/>
+                    </a:xfrm>
+                    <a:prstGeom prst="rect"/>
+                  </pic:spPr>
+                </pic:pic>
+              </a:graphicData>
+            </a:graphic>
+          </wp:inline>
+        </w:drawing>
+      </w:r>
+    </w:p>
+    <w:p>
+      <w:pPr>
+        <w:pStyle w:val="Caption"/>
+        <w:jc w:val="center"/>
+      </w:pPr>
+      <w:r>
+        <w:rPr>
+          <w:i/>
+          <w:color w:val="6B6862"/>
+          <w:sz w:val="19"/>
+        </w:rPr>
+        <w:t>Figure 7 — Claude Code in the Claude Desktop app (Code tab)</w:t>
+      </w:r>
+    </w:p>
+    <w:p>
+      <w:pPr>
+        <w:numPr>
+          <w:ilvl w:val="0"/>
+          <w:numId w:val="18"/>
+        </w:numPr>
+        <w:pStyle w:val="Compact"/>
+      </w:pPr>
+      <w:r>
+        <w:rPr>
+          <w:b/>
+        </w:rPr>
+        <w:t>1 Open the Code tab —</w:t>
+      </w:r>
+      <w:r>
+        <w:rPr/>
+        <w:t xml:space="preserve"> click the &lt;/&gt; icon at the top-left to switch from Chat to Claude Code.</w:t>
+      </w:r>
+    </w:p>
+    <w:p>
+      <w:pPr>
+        <w:numPr>
+          <w:ilvl w:val="0"/>
+          <w:numId w:val="18"/>
+        </w:numPr>
+        <w:pStyle w:val="Compact"/>
+      </w:pPr>
+      <w:r>
+        <w:rPr>
+          <w:b/>
+        </w:rPr>
+        <w:t>2 Choose your project folder —</w:t>
+      </w:r>
+      <w:r>
+        <w:rPr/>
+        <w:t xml:space="preserve"> pick a folder (here kanban8); Claude reads and edits files only inside it.</w:t>
+      </w:r>
+    </w:p>
+    <w:p>
+      <w:pPr>
+        <w:numPr>
+          <w:ilvl w:val="0"/>
+          <w:numId w:val="18"/>
+        </w:numPr>
+        <w:pStyle w:val="Compact"/>
+      </w:pPr>
+      <w:r>
+        <w:rPr>
+          <w:b/>
+        </w:rPr>
+        <w:t>3 Describe the task —</w:t>
+      </w:r>
+      <w:r>
+        <w:rPr/>
+        <w:t xml:space="preserve"> type your goal in plain English and press Enter.</w:t>
+      </w:r>
+    </w:p>
+    <w:p>
+      <w:pPr>
+        <w:numPr>
+          <w:ilvl w:val="0"/>
+          <w:numId w:val="18"/>
+        </w:numPr>
+        <w:pStyle w:val="Compact"/>
+      </w:pPr>
+      <w:r>
+        <w:rPr>
+          <w:b/>
+        </w:rPr>
+        <w:t>4 Check folder, mode &amp; model —</w:t>
+      </w:r>
+      <w:r>
+        <w:rPr/>
+        <w:t xml:space="preserve"> the status bar shows the folder, permission mode (Plan) and model (Sonnet 5.5 · Medium).</w:t>
+      </w:r>
+    </w:p>
+    <w:p>
+      <w:pPr>
+        <w:numPr>
+          <w:ilvl w:val="0"/>
+          <w:numId w:val="18"/>
+        </w:numPr>
+        <w:pStyle w:val="Compact"/>
+      </w:pPr>
+      <w:r>
+        <w:rPr>
+          <w:b/>
+        </w:rPr>
+        <w:t>5 Sessions grouped by project —</w:t>
+      </w:r>
+      <w:r>
+        <w:rPr/>
+        <w:t xml:space="preserve"> the sidebar lists past sessions under each project; click one to resume. “Import Claude Code CLI sessions” brings your terminal history in.</w:t>
+      </w:r>
+    </w:p>
+    <w:p>
+      <w:pPr>
         <w:pStyle w:val="FirstParagraph"/>
       </w:pPr>
       <w:r>
@@ -5460,7 +5475,7 @@
         <w:t xml:space="preserve">). Use this only in a trusted/sandboxed project.</w:t>
       </w:r>
       <w:r>
-        <w:t xml:space="preserve"> See Figures 6–7 in section 1.9.</w:t>
+        <w:t xml:space="preserve"> See Figures 1–2 in section 1.9.</w:t>
       </w:r>
     </w:p>
     <w:p>

</xml_diff>

<commit_message>
courseware v22: add two hook-example slides (10-second pop-up, voice greeting on chat click)
- Deck v22 (79 slides): two annotated "Hooks in Action" slides after
  Automating with Hooks (70-71); cover set to Version 22.0
- Learner Guide v2.0: Figures 12-13 with step-by-step explanations and code in 3.3 Hooks
- Lesson Plan v2.1: slide references recomputed (Topic 3 = 60-75, Activities 6-7 = 72-73, closing = 74-79)
- README points to v22

Co-Authored-By: Claude Opus 5.5 <noreply@anthropic.com>
</commit_message>
<xml_diff>
--- a/courseware/LG-Agentic AI Applications with Claude Code.docx
+++ b/courseware/LG-Agentic AI Applications with Claude Code.docx
@@ -169,7 +169,7 @@
           <w:b/>
           <w:sz w:val="24"/>
         </w:rPr>
-        <w:t>Version 1.9</w:t>
+        <w:t>Version 2.0</w:t>
       </w:r>
     </w:p>
     <w:p>
@@ -844,6 +844,60 @@
           </w:p>
         </w:tc>
       </w:tr>
+      <w:tr>
+        <w:tc>
+          <w:tcPr>
+            <w:tcW w:type="dxa" w:w="2340"/>
+          </w:tcPr>
+          <w:p>
+            <w:pPr/>
+            <w:r>
+              <w:rPr>
+                <w:rPr/>
+              </w:rPr>
+              <w:t>2.0</w:t>
+            </w:r>
+          </w:p>
+        </w:tc>
+        <w:tc>
+          <w:tcPr>
+            <w:tcW w:type="dxa" w:w="2340"/>
+          </w:tcPr>
+          <w:p>
+            <w:pPr/>
+            <w:r>
+              <w:rPr>
+                <w:rPr/>
+              </w:rPr>
+              <w:t>29 Oct 2026</w:t>
+            </w:r>
+          </w:p>
+        </w:tc>
+        <w:tc>
+          <w:tcPr>
+            <w:tcW w:type="dxa" w:w="2340"/>
+          </w:tcPr>
+          <w:p>
+            <w:r>
+              <w:t>Aligned with slide deck v22: added two annotated web-page hook examples with step-by-step explanations and code to 3.3 Hooks — a pop-up dialog 10 seconds after page load (Figure 12) and a voice greeting when the chat icon is clicked (Figure 13).</w:t>
+            </w:r>
+          </w:p>
+        </w:tc>
+        <w:tc>
+          <w:tcPr>
+            <w:tcW w:type="dxa" w:w="2340"/>
+          </w:tcPr>
+          <w:p>
+            <w:pPr/>
+            <w:r>
+              <w:rPr>
+                <w:rPr/>
+              </w:rPr>
+              <w:t>Tertiary Infotech Academy Pte Ltd</w:t>
+            </w:r>
+          </w:p>
+        </w:tc>
+      </w:tr>
     </w:tbl>
     <w:p>
       <w:r>
@@ -9795,6 +9849,351 @@
           <w:rStyle w:val="FunctionTok"/>
         </w:rPr>
         <w:t xml:space="preserve">}</w:t>
+      </w:r>
+    </w:p>
+    <w:p>
+      <w:pPr>
+        <w:pStyle w:val="BodyText"/>
+      </w:pPr>
+      <w:r>
+        <w:rPr>
+          <w:b/>
+        </w:rPr>
+        <w:t xml:space="preserve">Hooks in action on a web page. </w:t>
+      </w:r>
+      <w:r>
+        <w:rPr/>
+        <w:t>The same idea — run something automatically when an event happens — also powers engagement features on a website. These page-event hooks live in the site’s script.js and run in the visitor’s browser (not in Claude Code); you simply ask Claude Code, in plain English, to build them. You build similar ones in Activity 6.</w:t>
+      </w:r>
+    </w:p>
+    <w:p>
+      <w:pPr>
+        <w:pStyle w:val="BodyText"/>
+      </w:pPr>
+      <w:r>
+        <w:rPr>
+          <w:b/>
+        </w:rPr>
+        <w:t xml:space="preserve">Hook 1 — Pop-up after 10 seconds. </w:t>
+      </w:r>
+      <w:r>
+        <w:rPr/>
+        <w:t>A timer starts when the page loads; stay on the page for 10 seconds and a dialog pops up with a key message — no click needed.</w:t>
+      </w:r>
+    </w:p>
+    <w:p>
+      <w:pPr>
+        <w:pStyle w:val="BodyText"/>
+        <w:keepNext/>
+        <w:spacing w:before="120"/>
+        <w:jc w:val="center"/>
+      </w:pPr>
+      <w:r>
+        <w:drawing>
+          <wp:inline xmlns:a="http://schemas.openxmlformats.org/drawingml/2006/main" xmlns:pic="http://schemas.openxmlformats.org/drawingml/2006/picture">
+            <wp:extent cx="5486400" cy="3450175"/>
+            <wp:docPr id="13" name="Picture 13"/>
+            <wp:cNvGraphicFramePr>
+              <a:graphicFrameLocks noChangeAspect="1"/>
+            </wp:cNvGraphicFramePr>
+            <a:graphic>
+              <a:graphicData uri="http://schemas.openxmlformats.org/drawingml/2006/picture">
+                <pic:pic>
+                  <pic:nvPicPr>
+                    <pic:cNvPr id="0" name="h2_annotated.png"/>
+                    <pic:cNvPicPr/>
+                  </pic:nvPicPr>
+                  <pic:blipFill>
+                    <a:blip r:embed="rId22"/>
+                    <a:stretch>
+                      <a:fillRect/>
+                    </a:stretch>
+                  </pic:blipFill>
+                  <pic:spPr>
+                    <a:xfrm>
+                      <a:off x="0" y="0"/>
+                      <a:ext cx="5486400" cy="3450175"/>
+                    </a:xfrm>
+                    <a:prstGeom prst="rect"/>
+                  </pic:spPr>
+                </pic:pic>
+              </a:graphicData>
+            </a:graphic>
+          </wp:inline>
+        </w:drawing>
+      </w:r>
+    </w:p>
+    <w:p>
+      <w:pPr>
+        <w:pStyle w:val="Caption"/>
+        <w:jc w:val="center"/>
+      </w:pPr>
+      <w:r>
+        <w:rPr>
+          <w:i/>
+          <w:color w:val="6B6862"/>
+          <w:sz w:val="19"/>
+        </w:rPr>
+        <w:t>Figure 12 — A timed hook — the dialog pops up 10 seconds after the page loads</w:t>
+      </w:r>
+    </w:p>
+    <w:p>
+      <w:pPr>
+        <w:numPr>
+          <w:ilvl w:val="0"/>
+          <w:numId w:val="18"/>
+        </w:numPr>
+        <w:pStyle w:val="Compact"/>
+      </w:pPr>
+      <w:r>
+        <w:rPr>
+          <w:b/>
+        </w:rPr>
+        <w:t>1 The 10-second pop-up —</w:t>
+      </w:r>
+      <w:r>
+        <w:rPr/>
+        <w:t xml:space="preserve"> after 10 s the dialog opens and the page behind is dimmed, so attention goes to the message.</w:t>
+      </w:r>
+    </w:p>
+    <w:p>
+      <w:pPr>
+        <w:numPr>
+          <w:ilvl w:val="0"/>
+          <w:numId w:val="18"/>
+        </w:numPr>
+        <w:pStyle w:val="Compact"/>
+      </w:pPr>
+      <w:r>
+        <w:rPr>
+          <w:b/>
+        </w:rPr>
+        <w:t>2 One clear message —</w:t>
+      </w:r>
+      <w:r>
+        <w:rPr/>
+        <w:t xml:space="preserve"> a headline, a short sentence and the key facts (When / Where) at a glance.</w:t>
+      </w:r>
+    </w:p>
+    <w:p>
+      <w:pPr>
+        <w:numPr>
+          <w:ilvl w:val="0"/>
+          <w:numId w:val="18"/>
+        </w:numPr>
+        <w:pStyle w:val="Compact"/>
+      </w:pPr>
+      <w:r>
+        <w:rPr>
+          <w:b/>
+        </w:rPr>
+        <w:t>3 Easy to dismiss —</w:t>
+      </w:r>
+      <w:r>
+        <w:rPr/>
+        <w:t xml:space="preserve"> Got it closes the dialog and remembers it, so it shows only once per visitor.</w:t>
+      </w:r>
+    </w:p>
+    <w:p>
+      <w:pPr>
+        <w:pStyle w:val="SourceCode"/>
+      </w:pPr>
+      <w:r>
+        <w:rPr>
+          <w:rStyle w:val="FunctionTok"/>
+        </w:rPr>
+        <w:t>// script.js — runs in the visitor's browser</w:t>
+        <w:br/>
+        <w:t>setTimeout(() =&gt; {</w:t>
+        <w:br/>
+        <w:t xml:space="preserve">  if (!localStorage.getItem('briefingSeen'))</w:t>
+        <w:br/>
+        <w:t xml:space="preserve">    showBriefing();      // open the dialog</w:t>
+        <w:br/>
+        <w:t>}, 10000);               // 10 s after load</w:t>
+      </w:r>
+    </w:p>
+    <w:p>
+      <w:pPr>
+        <w:pStyle w:val="BodyText"/>
+      </w:pPr>
+      <w:r>
+        <w:rPr>
+          <w:b/>
+        </w:rPr>
+        <w:t xml:space="preserve">Hook 2 — Voice greeting on chat click. </w:t>
+      </w:r>
+      <w:r>
+        <w:rPr/>
+        <w:t>Click the chat icon and the assistant speaks a greeting as the chat panel opens, then offers one-tap topics that open WhatsApp.</w:t>
+      </w:r>
+    </w:p>
+    <w:p>
+      <w:pPr>
+        <w:pStyle w:val="BodyText"/>
+        <w:keepNext/>
+        <w:spacing w:before="120"/>
+        <w:jc w:val="center"/>
+      </w:pPr>
+      <w:r>
+        <w:drawing>
+          <wp:inline xmlns:a="http://schemas.openxmlformats.org/drawingml/2006/main" xmlns:pic="http://schemas.openxmlformats.org/drawingml/2006/picture">
+            <wp:extent cx="3291840" cy="3337349"/>
+            <wp:docPr id="14" name="Picture 14"/>
+            <wp:cNvGraphicFramePr>
+              <a:graphicFrameLocks noChangeAspect="1"/>
+            </wp:cNvGraphicFramePr>
+            <a:graphic>
+              <a:graphicData uri="http://schemas.openxmlformats.org/drawingml/2006/picture">
+                <pic:pic>
+                  <pic:nvPicPr>
+                    <pic:cNvPr id="0" name="h3_annotated.png"/>
+                    <pic:cNvPicPr/>
+                  </pic:nvPicPr>
+                  <pic:blipFill>
+                    <a:blip r:embed="rId23"/>
+                    <a:stretch>
+                      <a:fillRect/>
+                    </a:stretch>
+                  </pic:blipFill>
+                  <pic:spPr>
+                    <a:xfrm>
+                      <a:off x="0" y="0"/>
+                      <a:ext cx="3291840" cy="3337349"/>
+                    </a:xfrm>
+                    <a:prstGeom prst="rect"/>
+                  </pic:spPr>
+                </pic:pic>
+              </a:graphicData>
+            </a:graphic>
+          </wp:inline>
+        </w:drawing>
+      </w:r>
+    </w:p>
+    <w:p>
+      <w:pPr>
+        <w:pStyle w:val="Caption"/>
+        <w:jc w:val="center"/>
+      </w:pPr>
+      <w:r>
+        <w:rPr>
+          <w:i/>
+          <w:color w:val="6B6862"/>
+          <w:sz w:val="19"/>
+        </w:rPr>
+        <w:t>Figure 13 — An event hook — clicking the chat icon plays a voice greeting and opens the chat panel</w:t>
+      </w:r>
+    </w:p>
+    <w:p>
+      <w:pPr>
+        <w:numPr>
+          <w:ilvl w:val="0"/>
+          <w:numId w:val="18"/>
+        </w:numPr>
+        <w:pStyle w:val="Compact"/>
+      </w:pPr>
+      <w:r>
+        <w:rPr>
+          <w:b/>
+        </w:rPr>
+        <w:t>1 Click the chat icon —</w:t>
+      </w:r>
+      <w:r>
+        <w:rPr/>
+        <w:t xml:space="preserve"> the round WhatsApp button (bottom-right) is the trigger; the click event fires the hook.</w:t>
+      </w:r>
+    </w:p>
+    <w:p>
+      <w:pPr>
+        <w:numPr>
+          <w:ilvl w:val="0"/>
+          <w:numId w:val="18"/>
+        </w:numPr>
+        <w:pStyle w:val="Compact"/>
+      </w:pPr>
+      <w:r>
+        <w:rPr>
+          <w:b/>
+        </w:rPr>
+        <w:t>2 Voice greeting + welcome —</w:t>
+      </w:r>
+      <w:r>
+        <w:rPr/>
+        <w:t xml:space="preserve"> the assistant says “Hi, I am your assistant. How can I help you today?” as the panel opens.</w:t>
+      </w:r>
+    </w:p>
+    <w:p>
+      <w:pPr>
+        <w:numPr>
+          <w:ilvl w:val="0"/>
+          <w:numId w:val="18"/>
+        </w:numPr>
+        <w:pStyle w:val="Compact"/>
+      </w:pPr>
+      <w:r>
+        <w:rPr>
+          <w:b/>
+        </w:rPr>
+        <w:t>3 Quick-reply topics —</w:t>
+      </w:r>
+      <w:r>
+        <w:rPr/>
+        <w:t xml:space="preserve"> one-tap buttons for the most common questions, so the visitor need not type.</w:t>
+      </w:r>
+    </w:p>
+    <w:p>
+      <w:pPr>
+        <w:numPr>
+          <w:ilvl w:val="0"/>
+          <w:numId w:val="18"/>
+        </w:numPr>
+        <w:pStyle w:val="Compact"/>
+      </w:pPr>
+      <w:r>
+        <w:rPr>
+          <w:b/>
+        </w:rPr>
+        <w:t>4 Hand-off to WhatsApp —</w:t>
+      </w:r>
+      <w:r>
+        <w:rPr/>
+        <w:t xml:space="preserve"> picking a topic opens WhatsApp with the question ready to send.</w:t>
+      </w:r>
+    </w:p>
+    <w:p>
+      <w:pPr>
+        <w:pStyle w:val="SourceCode"/>
+      </w:pPr>
+      <w:r>
+        <w:rPr>
+          <w:rStyle w:val="FunctionTok"/>
+        </w:rPr>
+        <w:t>// script.js — Web Speech API (speech synthesis)</w:t>
+        <w:br/>
+        <w:t>chatIcon.addEventListener('click', () =&gt; {</w:t>
+        <w:br/>
+        <w:t xml:space="preserve">  openPanel();</w:t>
+        <w:br/>
+        <w:t xml:space="preserve">  speechSynthesis.speak(new SpeechSynthesisUtterance(</w:t>
+        <w:br/>
+        <w:t xml:space="preserve">    'Hi, I am your assistant. How can I help you today?'));</w:t>
+        <w:br/>
+        <w:t>});</w:t>
+      </w:r>
+    </w:p>
+    <w:p>
+      <w:pPr>
+        <w:pStyle w:val="BodyText"/>
+      </w:pPr>
+      <w:r>
+        <w:rPr>
+          <w:b/>
+        </w:rPr>
+        <w:t xml:space="preserve">Tip: </w:t>
+      </w:r>
+      <w:r>
+        <w:rPr/>
+        <w:t>browsers block sound until the visitor interacts with the page — that is why the voice greeting plays on the click, not on page load.</w:t>
       </w:r>
     </w:p>
     <w:p>

</xml_diff>